<commit_message>
docs: shorten meeting guide to 10 guiding questions
</commit_message>
<xml_diff>
--- a/docs/guia-reunion/Guia de Reunion de Levantamiento.docx
+++ b/docs/guia-reunion/Guia de Reunion de Levantamiento.docx
@@ -233,7 +233,7 @@
                                   <w:pStyle w:val="BajadaPortada"/>
                                 </w:pPr>
                                 <w:r>
-                                  <w:t>Batería de preguntas para iniciativas de automatización CoE</w:t>
+                                  <w:t>10 preguntas guía para iniciativas de automatización CoE</w:t>
                                 </w:r>
                               </w:p>
                               <w:p>
@@ -265,7 +265,7 @@
                             <w:pStyle w:val="BajadaPortada"/>
                           </w:pPr>
                           <w:r>
-                            <w:t>Batería de preguntas para iniciativas de automatización CoE</w:t>
+                            <w:t>10 preguntas guía para iniciativas de automatización CoE</w:t>
                           </w:r>
                         </w:p>
                         <w:p>
@@ -457,7 +457,7 @@
           </w:tcPr>
           <w:p>
             <w:r>
-              <w:t>1.0</w:t>
+              <w:t>1.1</w:t>
             </w:r>
           </w:p>
         </w:tc>
@@ -470,7 +470,7 @@
               <w:cnfStyle w:val="000000000000" w:firstRow="0" w:lastRow="0" w:firstColumn="0" w:lastColumn="0" w:oddVBand="0" w:evenVBand="0" w:oddHBand="0" w:evenHBand="0" w:firstRowFirstColumn="0" w:firstRowLastColumn="0" w:lastRowFirstColumn="0" w:lastRowLastColumn="0"/>
             </w:pPr>
             <w:r>
-              <w:t>Creación del documento</w:t>
+              <w:t>Versión reducida a 10 preguntas guía</w:t>
             </w:r>
           </w:p>
         </w:tc>
@@ -908,24 +908,37 @@
         <w:pStyle w:val="Ttulo1"/>
       </w:pPr>
       <w:r>
-        <w:t xml:space="preserve">Objetivo</w:t>
-      </w:r>
-    </w:p>
-    <w:p>
-      <w:pPr>
-        <w:pStyle w:val="Ttulo2"/>
-        <w:numPr>
-          <w:ilvl w:val="1"/>
-          <w:numId w:val="1"/>
-        </w:numPr>
-      </w:pPr>
-      <w:r>
-        <w:t xml:space="preserve">Propósito del documento</w:t>
+        <w:t xml:space="preserve">Cómo usar esta guía</w:t>
       </w:r>
     </w:p>
     <w:p>
       <w:r>
-        <w:t xml:space="preserve">Esta guía ordena las preguntas de una reunión de levantamiento técnico para obtener, en una sola conversación, la información que necesita el pipeline </w:t>
+        <w:t xml:space="preserve">Diez preguntas para conducir una reunión de levantamiento de </w:t>
+      </w:r>
+      <w:r>
+        <w:rPr>
+          <w:b/>
+          <w:bCs/>
+        </w:rPr>
+        <w:t xml:space="preserve">20 a 40 minutos</w:t>
+      </w:r>
+      <w:r>
+        <w:t xml:space="preserve">. No es un cuestionario rígido: cada pregunta abre una conversación, y la columna </w:t>
+      </w:r>
+      <w:r>
+        <w:rPr>
+          <w:b/>
+          <w:bCs/>
+        </w:rPr>
+        <w:t xml:space="preserve">Qué rescatar</w:t>
+      </w:r>
+      <w:r>
+        <w:t xml:space="preserve"> indica lo que conviene que quede dicho antes de pasar a la siguiente.</w:t>
+      </w:r>
+    </w:p>
+    <w:p>
+      <w:r>
+        <w:t xml:space="preserve">Con estas respuestas, el pipeline </w:t>
       </w:r>
       <w:r>
         <w:rPr>
@@ -935,12 +948,7 @@
         <w:t xml:space="preserve">/evaluacion-proyectos</w:t>
       </w:r>
       <w:r>
-        <w:t xml:space="preserve"> para generar la propuesta, los casos de uso, las historias de usuario, el diagrama de secuencia y la valorización CoE.</w:t>
-      </w:r>
-    </w:p>
-    <w:p>
-      <w:r>
-        <w:t xml:space="preserve">No es un guion rígido: es una lista de verificación. Lo que no se pueda responder en la reunión quedará marcado como </w:t>
+        <w:t xml:space="preserve"> genera la propuesta, los casos de uso, las historias de usuario, el diagrama de secuencia y la valorización CoE. Lo que no se responda quedará como </w:t>
       </w:r>
       <w:r>
         <w:rPr>
@@ -950,77 +958,7 @@
         <w:t xml:space="preserve">[PENDIENTE]</w:t>
       </w:r>
       <w:r>
-        <w:t xml:space="preserve"> en los documentos generados.</w:t>
-      </w:r>
-    </w:p>
-    <w:p>
-      <w:pPr>
-        <w:pStyle w:val="Ttulo2"/>
-        <w:numPr>
-          <w:ilvl w:val="1"/>
-          <w:numId w:val="1"/>
-        </w:numPr>
-      </w:pPr>
-      <w:r>
-        <w:t xml:space="preserve">Cómo usar esta guía</w:t>
-      </w:r>
-    </w:p>
-    <w:p>
-      <w:pPr>
-        <w:pStyle w:val="Prrafodelista"/>
-        <w:numPr>
-          <w:ilvl w:val="0"/>
-          <w:numId w:val="28"/>
-        </w:numPr>
-      </w:pPr>
-      <w:r>
-        <w:t xml:space="preserve">Antes de la reunión, revisa la sección 2 y prepara la nomenclatura de la iniciativa.</w:t>
-      </w:r>
-    </w:p>
-    <w:p>
-      <w:pPr>
-        <w:pStyle w:val="Prrafodelista"/>
-        <w:numPr>
-          <w:ilvl w:val="0"/>
-          <w:numId w:val="28"/>
-        </w:numPr>
-      </w:pPr>
-      <w:r>
-        <w:t xml:space="preserve">Durante la reunión, recorre las secciones 3 a 11 en orden. Las preguntas marcadas con </w:t>
-      </w:r>
-      <w:r>
-        <w:rPr>
-          <w:b/>
-          <w:bCs/>
-        </w:rPr>
-        <w:t xml:space="preserve">(clave)</w:t>
-      </w:r>
-      <w:r>
-        <w:t xml:space="preserve"> son las mínimas para que el CoE pueda calcular el score.</w:t>
-      </w:r>
-    </w:p>
-    <w:p>
-      <w:pPr>
-        <w:pStyle w:val="Prrafodelista"/>
-        <w:numPr>
-          <w:ilvl w:val="0"/>
-          <w:numId w:val="28"/>
-        </w:numPr>
-      </w:pPr>
-      <w:r>
-        <w:t xml:space="preserve">Al cierre, haz el resumen verbal de la sección 12 para que los datos queden explícitos en la transcripción.</w:t>
-      </w:r>
-    </w:p>
-    <w:p>
-      <w:pPr>
-        <w:pStyle w:val="Prrafodelista"/>
-        <w:numPr>
-          <w:ilvl w:val="0"/>
-          <w:numId w:val="28"/>
-        </w:numPr>
-      </w:pPr>
-      <w:r>
-        <w:t xml:space="preserve">Descarga la transcripción desde Teams y ejecuta /evaluacion-proyectos.</w:t>
+        <w:t xml:space="preserve">, y está bien: algo es mejor que nada.</w:t>
       </w:r>
     </w:p>
     <w:p>
@@ -1032,7 +970,7 @@
         <w:t xml:space="preserve">Importante:</w:t>
       </w:r>
       <w:r>
-        <w:t xml:space="preserve"> el pipeline solo conoce lo que queda dicho en la transcripción. Un número que se muestra en pantalla pero no se dice en voz alta no existe para el pipeline.</w:t>
+        <w:t xml:space="preserve"> el pipeline solo conoce lo que se dice en voz alta. Un número que se muestra en pantalla pero no se dice no queda en la transcripción.</w:t>
       </w:r>
     </w:p>
     <w:p>
@@ -1041,6 +979,83 @@
       </w:pPr>
       <w:r>
         <w:t xml:space="preserve">Antes de la reunión</w:t>
+      </w:r>
+    </w:p>
+    <w:p>
+      <w:pPr>
+        <w:pStyle w:val="Prrafodelista"/>
+        <w:numPr>
+          <w:ilvl w:val="0"/>
+          <w:numId w:val="22"/>
+        </w:numPr>
+      </w:pPr>
+      <w:r>
+        <w:rPr>
+          <w:b/>
+          <w:bCs/>
+        </w:rPr>
+        <w:t xml:space="preserve">Activar la transcripción</w:t>
+      </w:r>
+      <w:r>
+        <w:t xml:space="preserve"> de Teams al iniciar. Sin transcripción no hay insumo.</w:t>
+      </w:r>
+    </w:p>
+    <w:p>
+      <w:pPr>
+        <w:pStyle w:val="Prrafodelista"/>
+        <w:numPr>
+          <w:ilvl w:val="0"/>
+          <w:numId w:val="22"/>
+        </w:numPr>
+      </w:pPr>
+      <w:r>
+        <w:rPr>
+          <w:b/>
+          <w:bCs/>
+        </w:rPr>
+        <w:t xml:space="preserve">Poner la nomenclatura en el asunto</w:t>
+      </w:r>
+      <w:r>
+        <w:t xml:space="preserve"> de la reunión (ej. 19-N1-COM-CL | Gestión Alerta Enlaces caídos | MON). El pipeline la toma de ahí.</w:t>
+      </w:r>
+    </w:p>
+    <w:p>
+      <w:pPr>
+        <w:pStyle w:val="Prrafodelista"/>
+        <w:numPr>
+          <w:ilvl w:val="0"/>
+          <w:numId w:val="22"/>
+        </w:numPr>
+      </w:pPr>
+      <w:r>
+        <w:rPr>
+          <w:b/>
+          <w:bCs/>
+        </w:rPr>
+        <w:t xml:space="preserve">Invitar a quien ejecuta hoy la tarea</w:t>
+      </w:r>
+      <w:r>
+        <w:t xml:space="preserve">, no solo a la jefatura: es quien conoce los pasos y los tiempos reales.</w:t>
+      </w:r>
+    </w:p>
+    <w:p>
+      <w:pPr>
+        <w:pStyle w:val="Ttulo1"/>
+      </w:pPr>
+      <w:r>
+        <w:t xml:space="preserve">Las 10 preguntas</w:t>
+      </w:r>
+    </w:p>
+    <w:p>
+      <w:pPr>
+        <w:pStyle w:val="Ttulo2"/>
+        <w:numPr>
+          <w:ilvl w:val="1"/>
+          <w:numId w:val="1"/>
+        </w:numPr>
+      </w:pPr>
+      <w:r>
+        <w:t xml:space="preserve">Situación actual (≈ 10 min)</w:t>
       </w:r>
     </w:p>
     <w:tbl>
@@ -1051,9 +1066,9 @@
         <w:tblLook w:val="0420" w:firstRow="1" w:lastRow="0" w:firstColumn="0" w:lastColumn="0" w:noHBand="0" w:noVBand="1"/>
       </w:tblPr>
       <w:tblGrid>
-        <w:gridCol w:w="662"/>
-        <w:gridCol w:w="4855"/>
-        <w:gridCol w:w="3310"/>
+        <w:gridCol w:w="552"/>
+        <w:gridCol w:w="4193"/>
+        <w:gridCol w:w="4083"/>
       </w:tblGrid>
       <w:tr>
         <w:trPr>
@@ -1062,7 +1077,7 @@
         </w:trPr>
         <w:tc>
           <w:tcPr>
-            <w:tcW w:w="662" w:type="dxa"/>
+            <w:tcW w:w="552" w:type="dxa"/>
             <w:vAlign w:val="center"/>
           </w:tcPr>
           <w:p>
@@ -1077,7 +1092,7 @@
         </w:tc>
         <w:tc>
           <w:tcPr>
-            <w:tcW w:w="4855" w:type="dxa"/>
+            <w:tcW w:w="4193" w:type="dxa"/>
             <w:vAlign w:val="center"/>
           </w:tcPr>
           <w:p>
@@ -1086,13 +1101,13 @@
               <w:jc w:val="center"/>
             </w:pPr>
             <w:r>
-              <w:t xml:space="preserve">Acción</w:t>
+              <w:t xml:space="preserve">Pregunta guía</w:t>
             </w:r>
           </w:p>
         </w:tc>
         <w:tc>
           <w:tcPr>
-            <w:tcW w:w="3310" w:type="dxa"/>
+            <w:tcW w:w="4083" w:type="dxa"/>
             <w:vAlign w:val="center"/>
           </w:tcPr>
           <w:p>
@@ -1101,7 +1116,7 @@
               <w:jc w:val="center"/>
             </w:pPr>
             <w:r>
-              <w:t xml:space="preserve">Por qué</w:t>
+              <w:t xml:space="preserve">Qué rescatar</w:t>
             </w:r>
           </w:p>
         </w:tc>
@@ -1112,7 +1127,7 @@
         </w:trPr>
         <w:tc>
           <w:tcPr>
-            <w:tcW w:w="662" w:type="dxa"/>
+            <w:tcW w:w="552" w:type="dxa"/>
             <w:vAlign w:val="center"/>
           </w:tcPr>
           <w:p>
@@ -1121,13 +1136,13 @@
               <w:jc w:val="left"/>
             </w:pPr>
             <w:r>
-              <w:t xml:space="preserve">2.1</w:t>
+              <w:t xml:space="preserve">1</w:t>
             </w:r>
           </w:p>
         </w:tc>
         <w:tc>
           <w:tcPr>
-            <w:tcW w:w="4855" w:type="dxa"/>
+            <w:tcW w:w="4193" w:type="dxa"/>
             <w:vAlign w:val="center"/>
           </w:tcPr>
           <w:p>
@@ -1136,23 +1151,13 @@
               <w:jc w:val="left"/>
             </w:pPr>
             <w:r>
-              <w:t xml:space="preserve">Activar la </w:t>
-            </w:r>
-            <w:r>
-              <w:rPr>
-                <w:b/>
-                <w:bCs/>
-              </w:rPr>
-              <w:t xml:space="preserve">grabación y transcripción</w:t>
-            </w:r>
-            <w:r>
-              <w:t xml:space="preserve"> de Teams al iniciar la reunión.</w:t>
+              <w:t xml:space="preserve">¿Qué se hace hoy, quién lo hace y qué función cumple en la operación?</w:t>
             </w:r>
           </w:p>
         </w:tc>
         <w:tc>
           <w:tcPr>
-            <w:tcW w:w="3310" w:type="dxa"/>
+            <w:tcW w:w="4083" w:type="dxa"/>
             <w:vAlign w:val="center"/>
           </w:tcPr>
           <w:p>
@@ -1161,7 +1166,7 @@
               <w:jc w:val="left"/>
             </w:pPr>
             <w:r>
-              <w:t xml:space="preserve">Sin transcripción no hay insumo para el pipeline.</w:t>
+              <w:t xml:space="preserve">Pasos actuales, responsable, torre y solicitante.</w:t>
             </w:r>
           </w:p>
         </w:tc>
@@ -1172,7 +1177,7 @@
         </w:trPr>
         <w:tc>
           <w:tcPr>
-            <w:tcW w:w="662" w:type="dxa"/>
+            <w:tcW w:w="552" w:type="dxa"/>
             <w:vAlign w:val="center"/>
           </w:tcPr>
           <w:p>
@@ -1181,13 +1186,13 @@
               <w:jc w:val="left"/>
             </w:pPr>
             <w:r>
-              <w:t xml:space="preserve">2.2</w:t>
+              <w:t xml:space="preserve">2</w:t>
             </w:r>
           </w:p>
         </w:tc>
         <w:tc>
           <w:tcPr>
-            <w:tcW w:w="4855" w:type="dxa"/>
+            <w:tcW w:w="4193" w:type="dxa"/>
             <w:vAlign w:val="center"/>
           </w:tcPr>
           <w:p>
@@ -1196,13 +1201,13 @@
               <w:jc w:val="left"/>
             </w:pPr>
             <w:r>
-              <w:t xml:space="preserve">Definir la nomenclatura: código, nombre y tag (ej. 19-N1-COM-CL | Gestión Alerta Enlaces caídos | MON). Usarla como asunto de la reunión.</w:t>
+              <w:t xml:space="preserve">¿Qué problema genera hoy y qué pasa si no se hace o se hace tarde?</w:t>
             </w:r>
           </w:p>
         </w:tc>
         <w:tc>
           <w:tcPr>
-            <w:tcW w:w="3310" w:type="dxa"/>
+            <w:tcW w:w="4083" w:type="dxa"/>
             <w:vAlign w:val="center"/>
           </w:tcPr>
           <w:p>
@@ -1211,7 +1216,7 @@
               <w:jc w:val="left"/>
             </w:pPr>
             <w:r>
-              <w:t xml:space="preserve">El pipeline la toma del asunto y nombra la carpeta y los archivos.</w:t>
+              <w:t xml:space="preserve">Errores humanos, impacto en clientes o SLA, multas, dependencia de personas clave.</w:t>
             </w:r>
           </w:p>
         </w:tc>
@@ -1222,7 +1227,7 @@
         </w:trPr>
         <w:tc>
           <w:tcPr>
-            <w:tcW w:w="662" w:type="dxa"/>
+            <w:tcW w:w="552" w:type="dxa"/>
             <w:vAlign w:val="center"/>
           </w:tcPr>
           <w:p>
@@ -1231,13 +1236,13 @@
               <w:jc w:val="left"/>
             </w:pPr>
             <w:r>
-              <w:t xml:space="preserve">2.3</w:t>
+              <w:t xml:space="preserve">3</w:t>
             </w:r>
           </w:p>
         </w:tc>
         <w:tc>
           <w:tcPr>
-            <w:tcW w:w="4855" w:type="dxa"/>
+            <w:tcW w:w="4193" w:type="dxa"/>
             <w:vAlign w:val="center"/>
           </w:tcPr>
           <w:p>
@@ -1246,23 +1251,13 @@
               <w:jc w:val="left"/>
             </w:pPr>
             <w:r>
-              <w:t xml:space="preserve">Invitar a quien </w:t>
-            </w:r>
-            <w:r>
-              <w:rPr>
-                <w:b/>
-                <w:bCs/>
-              </w:rPr>
-              <w:t xml:space="preserve">ejecuta hoy la tarea</w:t>
-            </w:r>
-            <w:r>
-              <w:t xml:space="preserve"> manual, no solo a la jefatura.</w:t>
+              <w:t xml:space="preserve">¿Cuántas veces al mes ocurre, cuánto demora cada vez y qué parte podría hacerse sola?</w:t>
             </w:r>
           </w:p>
         </w:tc>
         <w:tc>
           <w:tcPr>
-            <w:tcW w:w="3310" w:type="dxa"/>
+            <w:tcW w:w="4083" w:type="dxa"/>
             <w:vAlign w:val="center"/>
           </w:tcPr>
           <w:p>
@@ -1271,57 +1266,37 @@
               <w:jc w:val="left"/>
             </w:pPr>
             <w:r>
-              <w:t xml:space="preserve">Es quien conoce los pasos reales, tiempos y excepciones.</w:t>
-            </w:r>
-          </w:p>
-        </w:tc>
-      </w:tr>
-      <w:tr>
-        <w:trPr>
-          <w:cantSplit/>
-        </w:trPr>
-        <w:tc>
-          <w:tcPr>
-            <w:tcW w:w="662" w:type="dxa"/>
-            <w:vAlign w:val="center"/>
-          </w:tcPr>
-          <w:p>
-            <w:pPr>
-              <w:spacing w:before="40" w:after="40" w:line="259" w:lineRule="auto"/>
-              <w:jc w:val="left"/>
-            </w:pPr>
-            <w:r>
-              <w:t xml:space="preserve">2.4</w:t>
-            </w:r>
-          </w:p>
-        </w:tc>
-        <w:tc>
-          <w:tcPr>
-            <w:tcW w:w="4855" w:type="dxa"/>
-            <w:vAlign w:val="center"/>
-          </w:tcPr>
-          <w:p>
-            <w:pPr>
-              <w:spacing w:before="40" w:after="40" w:line="259" w:lineRule="auto"/>
-              <w:jc w:val="left"/>
-            </w:pPr>
-            <w:r>
-              <w:t xml:space="preserve">Pedir que tengan a mano: ejemplos de alertas, correos, tickets o reportes del proceso.</w:t>
-            </w:r>
-          </w:p>
-        </w:tc>
-        <w:tc>
-          <w:tcPr>
-            <w:tcW w:w="3310" w:type="dxa"/>
-            <w:vAlign w:val="center"/>
-          </w:tcPr>
-          <w:p>
-            <w:pPr>
-              <w:spacing w:before="40" w:after="40" w:line="259" w:lineRule="auto"/>
-              <w:jc w:val="left"/>
-            </w:pPr>
-            <w:r>
-              <w:t xml:space="preserve">Permite describir entradas y salidas con precisión.</w:t>
+              <w:t xml:space="preserve">Tres números dichos en voz alta: </w:t>
+            </w:r>
+            <w:r>
+              <w:rPr>
+                <w:b/>
+                <w:bCs/>
+              </w:rPr>
+              <w:t xml:space="preserve">eventos/mes</w:t>
+            </w:r>
+            <w:r>
+              <w:t xml:space="preserve">, </w:t>
+            </w:r>
+            <w:r>
+              <w:rPr>
+                <w:b/>
+                <w:bCs/>
+              </w:rPr>
+              <w:t xml:space="preserve">minutos por vez</w:t>
+            </w:r>
+            <w:r>
+              <w:t xml:space="preserve"> y </w:t>
+            </w:r>
+            <w:r>
+              <w:rPr>
+                <w:b/>
+                <w:bCs/>
+              </w:rPr>
+              <w:t xml:space="preserve">% automatizable</w:t>
+            </w:r>
+            <w:r>
+              <w:t xml:space="preserve">.</w:t>
             </w:r>
           </w:p>
         </w:tc>
@@ -1330,35 +1305,14 @@
     <w:p/>
     <w:p>
       <w:pPr>
-        <w:pStyle w:val="Ttulo1"/>
+        <w:pStyle w:val="Ttulo2"/>
+        <w:numPr>
+          <w:ilvl w:val="1"/>
+          <w:numId w:val="1"/>
+        </w:numPr>
       </w:pPr>
       <w:r>
-        <w:t xml:space="preserve">Contexto y situación actual</w:t>
-      </w:r>
-    </w:p>
-    <w:p>
-      <w:r>
-        <w:t xml:space="preserve">Alimenta: </w:t>
-      </w:r>
-      <w:r>
-        <w:rPr>
-          <w:b/>
-          <w:bCs/>
-        </w:rPr>
-        <w:t xml:space="preserve">Contexto</w:t>
-      </w:r>
-      <w:r>
-        <w:t xml:space="preserve"> de la propuesta e </w:t>
-      </w:r>
-      <w:r>
-        <w:rPr>
-          <w:b/>
-          <w:bCs/>
-        </w:rPr>
-        <w:t xml:space="preserve">Impacto en Negocio</w:t>
-      </w:r>
-      <w:r>
-        <w:t xml:space="preserve">.</w:t>
+        <w:t xml:space="preserve">El proceso y la solución (≈ 15 min)</w:t>
       </w:r>
     </w:p>
     <w:tbl>
@@ -1369,9 +1323,9 @@
         <w:tblLook w:val="0420" w:firstRow="1" w:lastRow="0" w:firstColumn="0" w:lastColumn="0" w:noHBand="0" w:noVBand="1"/>
       </w:tblPr>
       <w:tblGrid>
-        <w:gridCol w:w="662"/>
-        <w:gridCol w:w="5076"/>
-        <w:gridCol w:w="3090"/>
+        <w:gridCol w:w="552"/>
+        <w:gridCol w:w="4193"/>
+        <w:gridCol w:w="4083"/>
       </w:tblGrid>
       <w:tr>
         <w:trPr>
@@ -1380,7 +1334,7 @@
         </w:trPr>
         <w:tc>
           <w:tcPr>
-            <w:tcW w:w="662" w:type="dxa"/>
+            <w:tcW w:w="552" w:type="dxa"/>
             <w:vAlign w:val="center"/>
           </w:tcPr>
           <w:p>
@@ -1395,7 +1349,7 @@
         </w:tc>
         <w:tc>
           <w:tcPr>
-            <w:tcW w:w="5076" w:type="dxa"/>
+            <w:tcW w:w="4193" w:type="dxa"/>
             <w:vAlign w:val="center"/>
           </w:tcPr>
           <w:p>
@@ -1404,13 +1358,13 @@
               <w:jc w:val="center"/>
             </w:pPr>
             <w:r>
-              <w:t xml:space="preserve">Pregunta</w:t>
+              <w:t xml:space="preserve">Pregunta guía</w:t>
             </w:r>
           </w:p>
         </w:tc>
         <w:tc>
           <w:tcPr>
-            <w:tcW w:w="3090" w:type="dxa"/>
+            <w:tcW w:w="4083" w:type="dxa"/>
             <w:vAlign w:val="center"/>
           </w:tcPr>
           <w:p>
@@ -1419,7 +1373,7 @@
               <w:jc w:val="center"/>
             </w:pPr>
             <w:r>
-              <w:t xml:space="preserve">Para qué sirve</w:t>
+              <w:t xml:space="preserve">Qué rescatar</w:t>
             </w:r>
           </w:p>
         </w:tc>
@@ -1430,7 +1384,7 @@
         </w:trPr>
         <w:tc>
           <w:tcPr>
-            <w:tcW w:w="662" w:type="dxa"/>
+            <w:tcW w:w="552" w:type="dxa"/>
             <w:vAlign w:val="center"/>
           </w:tcPr>
           <w:p>
@@ -1439,13 +1393,13 @@
               <w:jc w:val="left"/>
             </w:pPr>
             <w:r>
-              <w:t xml:space="preserve">3.1</w:t>
+              <w:t xml:space="preserve">4</w:t>
             </w:r>
           </w:p>
         </w:tc>
         <w:tc>
           <w:tcPr>
-            <w:tcW w:w="5076" w:type="dxa"/>
+            <w:tcW w:w="4193" w:type="dxa"/>
             <w:vAlign w:val="center"/>
           </w:tcPr>
           <w:p>
@@ -1454,13 +1408,13 @@
               <w:jc w:val="left"/>
             </w:pPr>
             <w:r>
-              <w:t xml:space="preserve">(clave) ¿Qué se hace hoy, paso a paso, y quién lo hace?</w:t>
+              <w:t xml:space="preserve">¿Qué sistemas intervienen y cómo se accede a ellos?</w:t>
             </w:r>
           </w:p>
         </w:tc>
         <w:tc>
           <w:tcPr>
-            <w:tcW w:w="3090" w:type="dxa"/>
+            <w:tcW w:w="4083" w:type="dxa"/>
             <w:vAlign w:val="center"/>
           </w:tcPr>
           <w:p>
@@ -1469,7 +1423,7 @@
               <w:jc w:val="left"/>
             </w:pPr>
             <w:r>
-              <w:t xml:space="preserve">Contexto y flujo actual</w:t>
+              <w:t xml:space="preserve">Nombre de cada sistema y si tiene API, base de datos, consola o solo pantalla.</w:t>
             </w:r>
           </w:p>
         </w:tc>
@@ -1480,7 +1434,7 @@
         </w:trPr>
         <w:tc>
           <w:tcPr>
-            <w:tcW w:w="662" w:type="dxa"/>
+            <w:tcW w:w="552" w:type="dxa"/>
             <w:vAlign w:val="center"/>
           </w:tcPr>
           <w:p>
@@ -1489,13 +1443,13 @@
               <w:jc w:val="left"/>
             </w:pPr>
             <w:r>
-              <w:t xml:space="preserve">3.2</w:t>
+              <w:t xml:space="preserve">5</w:t>
             </w:r>
           </w:p>
         </w:tc>
         <w:tc>
           <w:tcPr>
-            <w:tcW w:w="5076" w:type="dxa"/>
+            <w:tcW w:w="4193" w:type="dxa"/>
             <w:vAlign w:val="center"/>
           </w:tcPr>
           <w:p>
@@ -1504,13 +1458,13 @@
               <w:jc w:val="left"/>
             </w:pPr>
             <w:r>
-              <w:t xml:space="preserve">¿Qué función cumple esta tarea en la operación? ¿Qué pasa si no se hace o se hace tarde?</w:t>
+              <w:t xml:space="preserve">¿Qué dispara el proceso y cuáles son los pasos hasta el resultado?</w:t>
             </w:r>
           </w:p>
         </w:tc>
         <w:tc>
           <w:tcPr>
-            <w:tcW w:w="3090" w:type="dxa"/>
+            <w:tcW w:w="4083" w:type="dxa"/>
             <w:vAlign w:val="center"/>
           </w:tcPr>
           <w:p>
@@ -1519,7 +1473,7 @@
               <w:jc w:val="left"/>
             </w:pPr>
             <w:r>
-              <w:t xml:space="preserve">Contexto e impacto</w:t>
+              <w:t xml:space="preserve">El disparador (alerta, correo, hora), los pasos en orden y dónde queda registrado el resultado.</w:t>
             </w:r>
           </w:p>
         </w:tc>
@@ -1530,7 +1484,7 @@
         </w:trPr>
         <w:tc>
           <w:tcPr>
-            <w:tcW w:w="662" w:type="dxa"/>
+            <w:tcW w:w="552" w:type="dxa"/>
             <w:vAlign w:val="center"/>
           </w:tcPr>
           <w:p>
@@ -1539,13 +1493,13 @@
               <w:jc w:val="left"/>
             </w:pPr>
             <w:r>
-              <w:t xml:space="preserve">3.3</w:t>
+              <w:t xml:space="preserve">6</w:t>
             </w:r>
           </w:p>
         </w:tc>
         <w:tc>
           <w:tcPr>
-            <w:tcW w:w="5076" w:type="dxa"/>
+            <w:tcW w:w="4193" w:type="dxa"/>
             <w:vAlign w:val="center"/>
           </w:tcPr>
           <w:p>
@@ -1554,13 +1508,13 @@
               <w:jc w:val="left"/>
             </w:pPr>
             <w:r>
-              <w:t xml:space="preserve">¿Qué torre o área lo solicita? ¿Quién es el solicitante?</w:t>
+              <w:t xml:space="preserve">¿Qué esperan que haga la automatización y qué queda fuera de esta primera fase?</w:t>
             </w:r>
           </w:p>
         </w:tc>
         <w:tc>
           <w:tcPr>
-            <w:tcW w:w="3090" w:type="dxa"/>
+            <w:tcW w:w="4083" w:type="dxa"/>
             <w:vAlign w:val="center"/>
           </w:tcPr>
           <w:p>
@@ -1569,7 +1523,7 @@
               <w:jc w:val="left"/>
             </w:pPr>
             <w:r>
-              <w:t xml:space="preserve">Torre / solicitante</w:t>
+              <w:t xml:space="preserve">Objetivo, lo indispensable para la fase 1 y lo que se posterga (con el porqué).</w:t>
             </w:r>
           </w:p>
         </w:tc>
@@ -1580,7 +1534,7 @@
         </w:trPr>
         <w:tc>
           <w:tcPr>
-            <w:tcW w:w="662" w:type="dxa"/>
+            <w:tcW w:w="552" w:type="dxa"/>
             <w:vAlign w:val="center"/>
           </w:tcPr>
           <w:p>
@@ -1589,13 +1543,13 @@
               <w:jc w:val="left"/>
             </w:pPr>
             <w:r>
-              <w:t xml:space="preserve">3.4</w:t>
+              <w:t xml:space="preserve">7</w:t>
             </w:r>
           </w:p>
         </w:tc>
         <w:tc>
           <w:tcPr>
-            <w:tcW w:w="5076" w:type="dxa"/>
+            <w:tcW w:w="4193" w:type="dxa"/>
             <w:vAlign w:val="center"/>
           </w:tcPr>
           <w:p>
@@ -1604,13 +1558,13 @@
               <w:jc w:val="left"/>
             </w:pPr>
             <w:r>
-              <w:t xml:space="preserve">¿Afecta directamente a clientes, al SLA o a la continuidad de un servicio crítico?</w:t>
+              <w:t xml:space="preserve">¿Quién recibe el resultado y qué debe cumplir para darlo por bueno?</w:t>
             </w:r>
           </w:p>
         </w:tc>
         <w:tc>
           <w:tcPr>
-            <w:tcW w:w="3090" w:type="dxa"/>
+            <w:tcW w:w="4083" w:type="dxa"/>
             <w:vAlign w:val="center"/>
           </w:tcPr>
           <w:p>
@@ -1619,57 +1573,7 @@
               <w:jc w:val="left"/>
             </w:pPr>
             <w:r>
-              <w:t xml:space="preserve">Impacto en Negocio</w:t>
-            </w:r>
-          </w:p>
-        </w:tc>
-      </w:tr>
-      <w:tr>
-        <w:trPr>
-          <w:cantSplit/>
-        </w:trPr>
-        <w:tc>
-          <w:tcPr>
-            <w:tcW w:w="662" w:type="dxa"/>
-            <w:vAlign w:val="center"/>
-          </w:tcPr>
-          <w:p>
-            <w:pPr>
-              <w:spacing w:before="40" w:after="40" w:line="259" w:lineRule="auto"/>
-              <w:jc w:val="left"/>
-            </w:pPr>
-            <w:r>
-              <w:t xml:space="preserve">3.5</w:t>
-            </w:r>
-          </w:p>
-        </w:tc>
-        <w:tc>
-          <w:tcPr>
-            <w:tcW w:w="5076" w:type="dxa"/>
-            <w:vAlign w:val="center"/>
-          </w:tcPr>
-          <w:p>
-            <w:pPr>
-              <w:spacing w:before="40" w:after="40" w:line="259" w:lineRule="auto"/>
-              <w:jc w:val="left"/>
-            </w:pPr>
-            <w:r>
-              <w:t xml:space="preserve">¿Hubo incidentes, reclamos o multas por errores o demoras en esta tarea?</w:t>
-            </w:r>
-          </w:p>
-        </w:tc>
-        <w:tc>
-          <w:tcPr>
-            <w:tcW w:w="3090" w:type="dxa"/>
-            <w:vAlign w:val="center"/>
-          </w:tcPr>
-          <w:p>
-            <w:pPr>
-              <w:spacing w:before="40" w:after="40" w:line="259" w:lineRule="auto"/>
-              <w:jc w:val="left"/>
-            </w:pPr>
-            <w:r>
-              <w:t xml:space="preserve">Impacto y riesgo</w:t>
+              <w:t xml:space="preserve">Quiénes lo usan, qué datos debe traer, en cuánto tiempo y qué no debe pasar nunca.</w:t>
             </w:r>
           </w:p>
         </w:tc>
@@ -1678,35 +1582,14 @@
     <w:p/>
     <w:p>
       <w:pPr>
-        <w:pStyle w:val="Ttulo1"/>
+        <w:pStyle w:val="Ttulo2"/>
+        <w:numPr>
+          <w:ilvl w:val="1"/>
+          <w:numId w:val="1"/>
+        </w:numPr>
       </w:pPr>
       <w:r>
-        <w:t xml:space="preserve">Problema y objetivos</w:t>
-      </w:r>
-    </w:p>
-    <w:p>
-      <w:r>
-        <w:t xml:space="preserve">Alimenta: </w:t>
-      </w:r>
-      <w:r>
-        <w:rPr>
-          <w:b/>
-          <w:bCs/>
-        </w:rPr>
-        <w:t xml:space="preserve">Objetivo general</w:t>
-      </w:r>
-      <w:r>
-        <w:t xml:space="preserve"> y </w:t>
-      </w:r>
-      <w:r>
-        <w:rPr>
-          <w:b/>
-          <w:bCs/>
-        </w:rPr>
-        <w:t xml:space="preserve">Objetivos específicos</w:t>
-      </w:r>
-      <w:r>
-        <w:t xml:space="preserve">.</w:t>
+        <w:t xml:space="preserve">Requisitos y proyección (≈ 8 min)</w:t>
       </w:r>
     </w:p>
     <w:tbl>
@@ -1717,9 +1600,9 @@
         <w:tblLook w:val="0420" w:firstRow="1" w:lastRow="0" w:firstColumn="0" w:lastColumn="0" w:noHBand="0" w:noVBand="1"/>
       </w:tblPr>
       <w:tblGrid>
-        <w:gridCol w:w="662"/>
-        <w:gridCol w:w="5076"/>
-        <w:gridCol w:w="3090"/>
+        <w:gridCol w:w="552"/>
+        <w:gridCol w:w="4193"/>
+        <w:gridCol w:w="4083"/>
       </w:tblGrid>
       <w:tr>
         <w:trPr>
@@ -1728,7 +1611,7 @@
         </w:trPr>
         <w:tc>
           <w:tcPr>
-            <w:tcW w:w="662" w:type="dxa"/>
+            <w:tcW w:w="552" w:type="dxa"/>
             <w:vAlign w:val="center"/>
           </w:tcPr>
           <w:p>
@@ -1743,7 +1626,7 @@
         </w:tc>
         <w:tc>
           <w:tcPr>
-            <w:tcW w:w="5076" w:type="dxa"/>
+            <w:tcW w:w="4193" w:type="dxa"/>
             <w:vAlign w:val="center"/>
           </w:tcPr>
           <w:p>
@@ -1752,13 +1635,13 @@
               <w:jc w:val="center"/>
             </w:pPr>
             <w:r>
-              <w:t xml:space="preserve">Pregunta</w:t>
+              <w:t xml:space="preserve">Pregunta guía</w:t>
             </w:r>
           </w:p>
         </w:tc>
         <w:tc>
           <w:tcPr>
-            <w:tcW w:w="3090" w:type="dxa"/>
+            <w:tcW w:w="4083" w:type="dxa"/>
             <w:vAlign w:val="center"/>
           </w:tcPr>
           <w:p>
@@ -1767,7 +1650,7 @@
               <w:jc w:val="center"/>
             </w:pPr>
             <w:r>
-              <w:t xml:space="preserve">Para qué sirve</w:t>
+              <w:t xml:space="preserve">Qué rescatar</w:t>
             </w:r>
           </w:p>
         </w:tc>
@@ -1778,7 +1661,7 @@
         </w:trPr>
         <w:tc>
           <w:tcPr>
-            <w:tcW w:w="662" w:type="dxa"/>
+            <w:tcW w:w="552" w:type="dxa"/>
             <w:vAlign w:val="center"/>
           </w:tcPr>
           <w:p>
@@ -1787,13 +1670,13 @@
               <w:jc w:val="left"/>
             </w:pPr>
             <w:r>
-              <w:t xml:space="preserve">4.1</w:t>
+              <w:t xml:space="preserve">8</w:t>
             </w:r>
           </w:p>
         </w:tc>
         <w:tc>
           <w:tcPr>
-            <w:tcW w:w="5076" w:type="dxa"/>
+            <w:tcW w:w="4193" w:type="dxa"/>
             <w:vAlign w:val="center"/>
           </w:tcPr>
           <w:p>
@@ -1802,13 +1685,13 @@
               <w:jc w:val="left"/>
             </w:pPr>
             <w:r>
-              <w:t xml:space="preserve">(clave) ¿Cuál es el principal problema del proceso actual?</w:t>
+              <w:t xml:space="preserve">¿Qué accesos, permisos o conexiones hay que pedir, y a quién?</w:t>
             </w:r>
           </w:p>
         </w:tc>
         <w:tc>
           <w:tcPr>
-            <w:tcW w:w="3090" w:type="dxa"/>
+            <w:tcW w:w="4083" w:type="dxa"/>
             <w:vAlign w:val="center"/>
           </w:tcPr>
           <w:p>
@@ -1817,7 +1700,7 @@
               <w:jc w:val="left"/>
             </w:pPr>
             <w:r>
-              <w:t xml:space="preserve">Objetivo general</w:t>
+              <w:t xml:space="preserve">Usuarios de servicio, permisos elevados, puertos o VPN y el responsable de gestionarlos.</w:t>
             </w:r>
           </w:p>
         </w:tc>
@@ -1828,7 +1711,7 @@
         </w:trPr>
         <w:tc>
           <w:tcPr>
-            <w:tcW w:w="662" w:type="dxa"/>
+            <w:tcW w:w="552" w:type="dxa"/>
             <w:vAlign w:val="center"/>
           </w:tcPr>
           <w:p>
@@ -1837,13 +1720,13 @@
               <w:jc w:val="left"/>
             </w:pPr>
             <w:r>
-              <w:t xml:space="preserve">4.2</w:t>
+              <w:t xml:space="preserve">9</w:t>
             </w:r>
           </w:p>
         </w:tc>
         <w:tc>
           <w:tcPr>
-            <w:tcW w:w="5076" w:type="dxa"/>
+            <w:tcW w:w="4193" w:type="dxa"/>
             <w:vAlign w:val="center"/>
           </w:tcPr>
           <w:p>
@@ -1852,13 +1735,13 @@
               <w:jc w:val="left"/>
             </w:pPr>
             <w:r>
-              <w:t xml:space="preserve">¿Qué resultado concreto esperan de la automatización?</w:t>
+              <w:t xml:space="preserve">Si la automatización falla, ¿qué debe pasar y a quién se avisa?</w:t>
             </w:r>
           </w:p>
         </w:tc>
         <w:tc>
           <w:tcPr>
-            <w:tcW w:w="3090" w:type="dxa"/>
+            <w:tcW w:w="4083" w:type="dxa"/>
             <w:vAlign w:val="center"/>
           </w:tcPr>
           <w:p>
@@ -1867,7 +1750,7 @@
               <w:jc w:val="left"/>
             </w:pPr>
             <w:r>
-              <w:t xml:space="preserve">Objetivo general</w:t>
+              <w:t xml:space="preserve">Plan de respaldo (volver a manual) y canal de aviso (correo, Teams, ticket).</w:t>
             </w:r>
           </w:p>
         </w:tc>
@@ -1878,7 +1761,7 @@
         </w:trPr>
         <w:tc>
           <w:tcPr>
-            <w:tcW w:w="662" w:type="dxa"/>
+            <w:tcW w:w="552" w:type="dxa"/>
             <w:vAlign w:val="center"/>
           </w:tcPr>
           <w:p>
@@ -1887,13 +1770,13 @@
               <w:jc w:val="left"/>
             </w:pPr>
             <w:r>
-              <w:t xml:space="preserve">4.3</w:t>
+              <w:t xml:space="preserve">10</w:t>
             </w:r>
           </w:p>
         </w:tc>
         <w:tc>
           <w:tcPr>
-            <w:tcW w:w="5076" w:type="dxa"/>
+            <w:tcW w:w="4193" w:type="dxa"/>
             <w:vAlign w:val="center"/>
           </w:tcPr>
           <w:p>
@@ -1902,13 +1785,13 @@
               <w:jc w:val="left"/>
             </w:pPr>
             <w:r>
-              <w:t xml:space="preserve">¿Qué partes del proceso esperan que haga el sistema solo y cuáles seguirán siendo manuales?</w:t>
+              <w:t xml:space="preserve">¿Este proceso existe en otros equipos o países, y apoya alguna iniciativa de TI?</w:t>
             </w:r>
           </w:p>
         </w:tc>
         <w:tc>
           <w:tcPr>
-            <w:tcW w:w="3090" w:type="dxa"/>
+            <w:tcW w:w="4083" w:type="dxa"/>
             <w:vAlign w:val="center"/>
           </w:tcPr>
           <w:p>
@@ -1917,57 +1800,7 @@
               <w:jc w:val="left"/>
             </w:pPr>
             <w:r>
-              <w:t xml:space="preserve">Objetivos específicos y % de automatización</w:t>
-            </w:r>
-          </w:p>
-        </w:tc>
-      </w:tr>
-      <w:tr>
-        <w:trPr>
-          <w:cantSplit/>
-        </w:trPr>
-        <w:tc>
-          <w:tcPr>
-            <w:tcW w:w="662" w:type="dxa"/>
-            <w:vAlign w:val="center"/>
-          </w:tcPr>
-          <w:p>
-            <w:pPr>
-              <w:spacing w:before="40" w:after="40" w:line="259" w:lineRule="auto"/>
-              <w:jc w:val="left"/>
-            </w:pPr>
-            <w:r>
-              <w:t xml:space="preserve">4.4</w:t>
-            </w:r>
-          </w:p>
-        </w:tc>
-        <w:tc>
-          <w:tcPr>
-            <w:tcW w:w="5076" w:type="dxa"/>
-            <w:vAlign w:val="center"/>
-          </w:tcPr>
-          <w:p>
-            <w:pPr>
-              <w:spacing w:before="40" w:after="40" w:line="259" w:lineRule="auto"/>
-              <w:jc w:val="left"/>
-            </w:pPr>
-            <w:r>
-              <w:t xml:space="preserve">¿Cómo sabremos que la automatización funciona? ¿Qué indicador mirarían?</w:t>
-            </w:r>
-          </w:p>
-        </w:tc>
-        <w:tc>
-          <w:tcPr>
-            <w:tcW w:w="3090" w:type="dxa"/>
-            <w:vAlign w:val="center"/>
-          </w:tcPr>
-          <w:p>
-            <w:pPr>
-              <w:spacing w:before="40" w:after="40" w:line="259" w:lineRule="auto"/>
-              <w:jc w:val="left"/>
-            </w:pPr>
-            <w:r>
-              <w:t xml:space="preserve">Criterios de aceptación</w:t>
+              <w:t xml:space="preserve">Potencial de reutilización y relación con el roadmap (cloud, DevOps, seguridad, AIOps).</w:t>
             </w:r>
           </w:p>
         </w:tc>
@@ -1979,2478 +1812,12 @@
         <w:pStyle w:val="Ttulo1"/>
       </w:pPr>
       <w:r>
-        <w:t xml:space="preserve">Volumen y tiempos</w:t>
+        <w:t xml:space="preserve">Cierre (≈ 3 min)</w:t>
       </w:r>
     </w:p>
     <w:p>
       <w:r>
-        <w:t xml:space="preserve">Alimenta: </w:t>
-      </w:r>
-      <w:r>
-        <w:rPr>
-          <w:b/>
-          <w:bCs/>
-        </w:rPr>
-        <w:t xml:space="preserve">Eficiencia Operativa</w:t>
-      </w:r>
-      <w:r>
-        <w:t xml:space="preserve"> (horas hombre ahorradas). Pide que los números se digan en voz alta.</w:t>
-      </w:r>
-    </w:p>
-    <w:tbl>
-      <w:tblPr>
-        <w:tblStyle w:val="TablaSONDA"/>
-        <w:tblW w:w="8828" w:type="dxa"/>
-        <w:tblLayout w:type="fixed"/>
-        <w:tblLook w:val="0420" w:firstRow="1" w:lastRow="0" w:firstColumn="0" w:lastColumn="0" w:noHBand="0" w:noVBand="1"/>
-      </w:tblPr>
-      <w:tblGrid>
-        <w:gridCol w:w="662"/>
-        <w:gridCol w:w="5076"/>
-        <w:gridCol w:w="3090"/>
-      </w:tblGrid>
-      <w:tr>
-        <w:trPr>
-          <w:cnfStyle w:val="100000000000" w:firstRow="1" w:lastRow="0" w:firstColumn="0" w:lastColumn="0" w:oddVBand="0" w:evenVBand="0" w:oddHBand="0" w:evenHBand="0" w:firstRowFirstColumn="0" w:firstRowLastColumn="0" w:lastRowFirstColumn="0" w:lastRowLastColumn="0"/>
-          <w:tblHeader/>
-        </w:trPr>
-        <w:tc>
-          <w:tcPr>
-            <w:tcW w:w="662" w:type="dxa"/>
-            <w:vAlign w:val="center"/>
-          </w:tcPr>
-          <w:p>
-            <w:pPr>
-              <w:spacing w:before="40" w:after="40" w:line="259" w:lineRule="auto"/>
-              <w:jc w:val="center"/>
-            </w:pPr>
-            <w:r>
-              <w:t xml:space="preserve">N°</w:t>
-            </w:r>
-          </w:p>
-        </w:tc>
-        <w:tc>
-          <w:tcPr>
-            <w:tcW w:w="5076" w:type="dxa"/>
-            <w:vAlign w:val="center"/>
-          </w:tcPr>
-          <w:p>
-            <w:pPr>
-              <w:spacing w:before="40" w:after="40" w:line="259" w:lineRule="auto"/>
-              <w:jc w:val="center"/>
-            </w:pPr>
-            <w:r>
-              <w:t xml:space="preserve">Pregunta</w:t>
-            </w:r>
-          </w:p>
-        </w:tc>
-        <w:tc>
-          <w:tcPr>
-            <w:tcW w:w="3090" w:type="dxa"/>
-            <w:vAlign w:val="center"/>
-          </w:tcPr>
-          <w:p>
-            <w:pPr>
-              <w:spacing w:before="40" w:after="40" w:line="259" w:lineRule="auto"/>
-              <w:jc w:val="center"/>
-            </w:pPr>
-            <w:r>
-              <w:t xml:space="preserve">Para qué sirve</w:t>
-            </w:r>
-          </w:p>
-        </w:tc>
-      </w:tr>
-      <w:tr>
-        <w:trPr>
-          <w:cantSplit/>
-        </w:trPr>
-        <w:tc>
-          <w:tcPr>
-            <w:tcW w:w="662" w:type="dxa"/>
-            <w:vAlign w:val="center"/>
-          </w:tcPr>
-          <w:p>
-            <w:pPr>
-              <w:spacing w:before="40" w:after="40" w:line="259" w:lineRule="auto"/>
-              <w:jc w:val="left"/>
-            </w:pPr>
-            <w:r>
-              <w:t xml:space="preserve">5.1</w:t>
-            </w:r>
-          </w:p>
-        </w:tc>
-        <w:tc>
-          <w:tcPr>
-            <w:tcW w:w="5076" w:type="dxa"/>
-            <w:vAlign w:val="center"/>
-          </w:tcPr>
-          <w:p>
-            <w:pPr>
-              <w:spacing w:before="40" w:after="40" w:line="259" w:lineRule="auto"/>
-              <w:jc w:val="left"/>
-            </w:pPr>
-            <w:r>
-              <w:t xml:space="preserve">(clave) ¿Cuántas veces al mes se ejecuta la tarea? (eventos, alertas, tickets, solicitudes)</w:t>
-            </w:r>
-          </w:p>
-        </w:tc>
-        <w:tc>
-          <w:tcPr>
-            <w:tcW w:w="3090" w:type="dxa"/>
-            <w:vAlign w:val="center"/>
-          </w:tcPr>
-          <w:p>
-            <w:pPr>
-              <w:spacing w:before="40" w:after="40" w:line="259" w:lineRule="auto"/>
-              <w:jc w:val="left"/>
-            </w:pPr>
-            <w:r>
-              <w:t xml:space="preserve">Volumen mensual</w:t>
-            </w:r>
-          </w:p>
-        </w:tc>
-      </w:tr>
-      <w:tr>
-        <w:trPr>
-          <w:cantSplit/>
-        </w:trPr>
-        <w:tc>
-          <w:tcPr>
-            <w:tcW w:w="662" w:type="dxa"/>
-            <w:vAlign w:val="center"/>
-          </w:tcPr>
-          <w:p>
-            <w:pPr>
-              <w:spacing w:before="40" w:after="40" w:line="259" w:lineRule="auto"/>
-              <w:jc w:val="left"/>
-            </w:pPr>
-            <w:r>
-              <w:t xml:space="preserve">5.2</w:t>
-            </w:r>
-          </w:p>
-        </w:tc>
-        <w:tc>
-          <w:tcPr>
-            <w:tcW w:w="5076" w:type="dxa"/>
-            <w:vAlign w:val="center"/>
-          </w:tcPr>
-          <w:p>
-            <w:pPr>
-              <w:spacing w:before="40" w:after="40" w:line="259" w:lineRule="auto"/>
-              <w:jc w:val="left"/>
-            </w:pPr>
-            <w:r>
-              <w:t xml:space="preserve">(clave) ¿Cuántos minutos toma cada ejecución manual, de principio a fin?</w:t>
-            </w:r>
-          </w:p>
-        </w:tc>
-        <w:tc>
-          <w:tcPr>
-            <w:tcW w:w="3090" w:type="dxa"/>
-            <w:vAlign w:val="center"/>
-          </w:tcPr>
-          <w:p>
-            <w:pPr>
-              <w:spacing w:before="40" w:after="40" w:line="259" w:lineRule="auto"/>
-              <w:jc w:val="left"/>
-            </w:pPr>
-            <w:r>
-              <w:t xml:space="preserve">Minutos por ejecución</w:t>
-            </w:r>
-          </w:p>
-        </w:tc>
-      </w:tr>
-      <w:tr>
-        <w:trPr>
-          <w:cantSplit/>
-        </w:trPr>
-        <w:tc>
-          <w:tcPr>
-            <w:tcW w:w="662" w:type="dxa"/>
-            <w:vAlign w:val="center"/>
-          </w:tcPr>
-          <w:p>
-            <w:pPr>
-              <w:spacing w:before="40" w:after="40" w:line="259" w:lineRule="auto"/>
-              <w:jc w:val="left"/>
-            </w:pPr>
-            <w:r>
-              <w:t xml:space="preserve">5.3</w:t>
-            </w:r>
-          </w:p>
-        </w:tc>
-        <w:tc>
-          <w:tcPr>
-            <w:tcW w:w="5076" w:type="dxa"/>
-            <w:vAlign w:val="center"/>
-          </w:tcPr>
-          <w:p>
-            <w:pPr>
-              <w:spacing w:before="40" w:after="40" w:line="259" w:lineRule="auto"/>
-              <w:jc w:val="left"/>
-            </w:pPr>
-            <w:r>
-              <w:t xml:space="preserve">(clave) ¿Qué porcentaje de esas ejecuciones podría resolverse sin intervención humana?</w:t>
-            </w:r>
-          </w:p>
-        </w:tc>
-        <w:tc>
-          <w:tcPr>
-            <w:tcW w:w="3090" w:type="dxa"/>
-            <w:vAlign w:val="center"/>
-          </w:tcPr>
-          <w:p>
-            <w:pPr>
-              <w:spacing w:before="40" w:after="40" w:line="259" w:lineRule="auto"/>
-              <w:jc w:val="left"/>
-            </w:pPr>
-            <w:r>
-              <w:t xml:space="preserve">% de automatización</w:t>
-            </w:r>
-          </w:p>
-        </w:tc>
-      </w:tr>
-      <w:tr>
-        <w:trPr>
-          <w:cantSplit/>
-        </w:trPr>
-        <w:tc>
-          <w:tcPr>
-            <w:tcW w:w="662" w:type="dxa"/>
-            <w:vAlign w:val="center"/>
-          </w:tcPr>
-          <w:p>
-            <w:pPr>
-              <w:spacing w:before="40" w:after="40" w:line="259" w:lineRule="auto"/>
-              <w:jc w:val="left"/>
-            </w:pPr>
-            <w:r>
-              <w:t xml:space="preserve">5.4</w:t>
-            </w:r>
-          </w:p>
-        </w:tc>
-        <w:tc>
-          <w:tcPr>
-            <w:tcW w:w="5076" w:type="dxa"/>
-            <w:vAlign w:val="center"/>
-          </w:tcPr>
-          <w:p>
-            <w:pPr>
-              <w:spacing w:before="40" w:after="40" w:line="259" w:lineRule="auto"/>
-              <w:jc w:val="left"/>
-            </w:pPr>
-            <w:r>
-              <w:t xml:space="preserve">¿Hay horarios o turnos especiales (7x24, fines de semana, peaks)?</w:t>
-            </w:r>
-          </w:p>
-        </w:tc>
-        <w:tc>
-          <w:tcPr>
-            <w:tcW w:w="3090" w:type="dxa"/>
-            <w:vAlign w:val="center"/>
-          </w:tcPr>
-          <w:p>
-            <w:pPr>
-              <w:spacing w:before="40" w:after="40" w:line="259" w:lineRule="auto"/>
-              <w:jc w:val="left"/>
-            </w:pPr>
-            <w:r>
-              <w:t xml:space="preserve">Contexto e impacto</w:t>
-            </w:r>
-          </w:p>
-        </w:tc>
-      </w:tr>
-      <w:tr>
-        <w:trPr>
-          <w:cantSplit/>
-        </w:trPr>
-        <w:tc>
-          <w:tcPr>
-            <w:tcW w:w="662" w:type="dxa"/>
-            <w:vAlign w:val="center"/>
-          </w:tcPr>
-          <w:p>
-            <w:pPr>
-              <w:spacing w:before="40" w:after="40" w:line="259" w:lineRule="auto"/>
-              <w:jc w:val="left"/>
-            </w:pPr>
-            <w:r>
-              <w:t xml:space="preserve">5.5</w:t>
-            </w:r>
-          </w:p>
-        </w:tc>
-        <w:tc>
-          <w:tcPr>
-            <w:tcW w:w="5076" w:type="dxa"/>
-            <w:vAlign w:val="center"/>
-          </w:tcPr>
-          <w:p>
-            <w:pPr>
-              <w:spacing w:before="40" w:after="40" w:line="259" w:lineRule="auto"/>
-              <w:jc w:val="left"/>
-            </w:pPr>
-            <w:r>
-              <w:t xml:space="preserve">¿Cuántas personas participan hoy en la tarea?</w:t>
-            </w:r>
-          </w:p>
-        </w:tc>
-        <w:tc>
-          <w:tcPr>
-            <w:tcW w:w="3090" w:type="dxa"/>
-            <w:vAlign w:val="center"/>
-          </w:tcPr>
-          <w:p>
-            <w:pPr>
-              <w:spacing w:before="40" w:after="40" w:line="259" w:lineRule="auto"/>
-              <w:jc w:val="left"/>
-            </w:pPr>
-            <w:r>
-              <w:t xml:space="preserve">Contexto</w:t>
-            </w:r>
-          </w:p>
-        </w:tc>
-      </w:tr>
-    </w:tbl>
-    <w:p/>
-    <w:p>
-      <w:pPr>
-        <w:pStyle w:val="Ttulo1"/>
-      </w:pPr>
-      <w:r>
-        <w:t xml:space="preserve">Flujo, actores y sistemas</w:t>
-      </w:r>
-    </w:p>
-    <w:p>
-      <w:r>
-        <w:t xml:space="preserve">Alimenta: </w:t>
-      </w:r>
-      <w:r>
-        <w:rPr>
-          <w:b/>
-          <w:bCs/>
-        </w:rPr>
-        <w:t xml:space="preserve">Casos de uso</w:t>
-      </w:r>
-      <w:r>
-        <w:t xml:space="preserve"> (actor, precondiciones, pasos, resultado) y </w:t>
-      </w:r>
-      <w:r>
-        <w:rPr>
-          <w:b/>
-          <w:bCs/>
-        </w:rPr>
-        <w:t xml:space="preserve">Diagrama de secuencia</w:t>
-      </w:r>
-      <w:r>
-        <w:t xml:space="preserve">.</w:t>
-      </w:r>
-    </w:p>
-    <w:tbl>
-      <w:tblPr>
-        <w:tblStyle w:val="TablaSONDA"/>
-        <w:tblW w:w="8828" w:type="dxa"/>
-        <w:tblLayout w:type="fixed"/>
-        <w:tblLook w:val="0420" w:firstRow="1" w:lastRow="0" w:firstColumn="0" w:lastColumn="0" w:noHBand="0" w:noVBand="1"/>
-      </w:tblPr>
-      <w:tblGrid>
-        <w:gridCol w:w="662"/>
-        <w:gridCol w:w="5076"/>
-        <w:gridCol w:w="3090"/>
-      </w:tblGrid>
-      <w:tr>
-        <w:trPr>
-          <w:cnfStyle w:val="100000000000" w:firstRow="1" w:lastRow="0" w:firstColumn="0" w:lastColumn="0" w:oddVBand="0" w:evenVBand="0" w:oddHBand="0" w:evenHBand="0" w:firstRowFirstColumn="0" w:firstRowLastColumn="0" w:lastRowFirstColumn="0" w:lastRowLastColumn="0"/>
-          <w:tblHeader/>
-        </w:trPr>
-        <w:tc>
-          <w:tcPr>
-            <w:tcW w:w="662" w:type="dxa"/>
-            <w:vAlign w:val="center"/>
-          </w:tcPr>
-          <w:p>
-            <w:pPr>
-              <w:spacing w:before="40" w:after="40" w:line="259" w:lineRule="auto"/>
-              <w:jc w:val="center"/>
-            </w:pPr>
-            <w:r>
-              <w:t xml:space="preserve">N°</w:t>
-            </w:r>
-          </w:p>
-        </w:tc>
-        <w:tc>
-          <w:tcPr>
-            <w:tcW w:w="5076" w:type="dxa"/>
-            <w:vAlign w:val="center"/>
-          </w:tcPr>
-          <w:p>
-            <w:pPr>
-              <w:spacing w:before="40" w:after="40" w:line="259" w:lineRule="auto"/>
-              <w:jc w:val="center"/>
-            </w:pPr>
-            <w:r>
-              <w:t xml:space="preserve">Pregunta</w:t>
-            </w:r>
-          </w:p>
-        </w:tc>
-        <w:tc>
-          <w:tcPr>
-            <w:tcW w:w="3090" w:type="dxa"/>
-            <w:vAlign w:val="center"/>
-          </w:tcPr>
-          <w:p>
-            <w:pPr>
-              <w:spacing w:before="40" w:after="40" w:line="259" w:lineRule="auto"/>
-              <w:jc w:val="center"/>
-            </w:pPr>
-            <w:r>
-              <w:t xml:space="preserve">Para qué sirve</w:t>
-            </w:r>
-          </w:p>
-        </w:tc>
-      </w:tr>
-      <w:tr>
-        <w:trPr>
-          <w:cantSplit/>
-        </w:trPr>
-        <w:tc>
-          <w:tcPr>
-            <w:tcW w:w="662" w:type="dxa"/>
-            <w:vAlign w:val="center"/>
-          </w:tcPr>
-          <w:p>
-            <w:pPr>
-              <w:spacing w:before="40" w:after="40" w:line="259" w:lineRule="auto"/>
-              <w:jc w:val="left"/>
-            </w:pPr>
-            <w:r>
-              <w:t xml:space="preserve">6.1</w:t>
-            </w:r>
-          </w:p>
-        </w:tc>
-        <w:tc>
-          <w:tcPr>
-            <w:tcW w:w="5076" w:type="dxa"/>
-            <w:vAlign w:val="center"/>
-          </w:tcPr>
-          <w:p>
-            <w:pPr>
-              <w:spacing w:before="40" w:after="40" w:line="259" w:lineRule="auto"/>
-              <w:jc w:val="left"/>
-            </w:pPr>
-            <w:r>
-              <w:t xml:space="preserve">(clave) ¿Qué sistemas intervienen? (monitoreo, ticketing, correo, bases de datos, servidores)</w:t>
-            </w:r>
-          </w:p>
-        </w:tc>
-        <w:tc>
-          <w:tcPr>
-            <w:tcW w:w="3090" w:type="dxa"/>
-            <w:vAlign w:val="center"/>
-          </w:tcPr>
-          <w:p>
-            <w:pPr>
-              <w:spacing w:before="40" w:after="40" w:line="259" w:lineRule="auto"/>
-              <w:jc w:val="left"/>
-            </w:pPr>
-            <w:r>
-              <w:t xml:space="preserve">Sistemas y participantes del diagrama</w:t>
-            </w:r>
-          </w:p>
-        </w:tc>
-      </w:tr>
-      <w:tr>
-        <w:trPr>
-          <w:cantSplit/>
-        </w:trPr>
-        <w:tc>
-          <w:tcPr>
-            <w:tcW w:w="662" w:type="dxa"/>
-            <w:vAlign w:val="center"/>
-          </w:tcPr>
-          <w:p>
-            <w:pPr>
-              <w:spacing w:before="40" w:after="40" w:line="259" w:lineRule="auto"/>
-              <w:jc w:val="left"/>
-            </w:pPr>
-            <w:r>
-              <w:t xml:space="preserve">6.2</w:t>
-            </w:r>
-          </w:p>
-        </w:tc>
-        <w:tc>
-          <w:tcPr>
-            <w:tcW w:w="5076" w:type="dxa"/>
-            <w:vAlign w:val="center"/>
-          </w:tcPr>
-          <w:p>
-            <w:pPr>
-              <w:spacing w:before="40" w:after="40" w:line="259" w:lineRule="auto"/>
-              <w:jc w:val="left"/>
-            </w:pPr>
-            <w:r>
-              <w:t xml:space="preserve">¿Qué dispara el proceso? (una alerta, un correo, una hora fija, una solicitud)</w:t>
-            </w:r>
-          </w:p>
-        </w:tc>
-        <w:tc>
-          <w:tcPr>
-            <w:tcW w:w="3090" w:type="dxa"/>
-            <w:vAlign w:val="center"/>
-          </w:tcPr>
-          <w:p>
-            <w:pPr>
-              <w:spacing w:before="40" w:after="40" w:line="259" w:lineRule="auto"/>
-              <w:jc w:val="left"/>
-            </w:pPr>
-            <w:r>
-              <w:t xml:space="preserve">Precondiciones y primer mensaje del diagrama</w:t>
-            </w:r>
-          </w:p>
-        </w:tc>
-      </w:tr>
-      <w:tr>
-        <w:trPr>
-          <w:cantSplit/>
-        </w:trPr>
-        <w:tc>
-          <w:tcPr>
-            <w:tcW w:w="662" w:type="dxa"/>
-            <w:vAlign w:val="center"/>
-          </w:tcPr>
-          <w:p>
-            <w:pPr>
-              <w:spacing w:before="40" w:after="40" w:line="259" w:lineRule="auto"/>
-              <w:jc w:val="left"/>
-            </w:pPr>
-            <w:r>
-              <w:t xml:space="preserve">6.3</w:t>
-            </w:r>
-          </w:p>
-        </w:tc>
-        <w:tc>
-          <w:tcPr>
-            <w:tcW w:w="5076" w:type="dxa"/>
-            <w:vAlign w:val="center"/>
-          </w:tcPr>
-          <w:p>
-            <w:pPr>
-              <w:spacing w:before="40" w:after="40" w:line="259" w:lineRule="auto"/>
-              <w:jc w:val="left"/>
-            </w:pPr>
-            <w:r>
-              <w:t xml:space="preserve">Para cada paso: ¿quién lo hace, en qué sistema y qué obtiene?</w:t>
-            </w:r>
-          </w:p>
-        </w:tc>
-        <w:tc>
-          <w:tcPr>
-            <w:tcW w:w="3090" w:type="dxa"/>
-            <w:vAlign w:val="center"/>
-          </w:tcPr>
-          <w:p>
-            <w:pPr>
-              <w:spacing w:before="40" w:after="40" w:line="259" w:lineRule="auto"/>
-              <w:jc w:val="left"/>
-            </w:pPr>
-            <w:r>
-              <w:t xml:space="preserve">Flujo de pasos y mensajes del diagrama</w:t>
-            </w:r>
-          </w:p>
-        </w:tc>
-      </w:tr>
-      <w:tr>
-        <w:trPr>
-          <w:cantSplit/>
-        </w:trPr>
-        <w:tc>
-          <w:tcPr>
-            <w:tcW w:w="662" w:type="dxa"/>
-            <w:vAlign w:val="center"/>
-          </w:tcPr>
-          <w:p>
-            <w:pPr>
-              <w:spacing w:before="40" w:after="40" w:line="259" w:lineRule="auto"/>
-              <w:jc w:val="left"/>
-            </w:pPr>
-            <w:r>
-              <w:t xml:space="preserve">6.4</w:t>
-            </w:r>
-          </w:p>
-        </w:tc>
-        <w:tc>
-          <w:tcPr>
-            <w:tcW w:w="5076" w:type="dxa"/>
-            <w:vAlign w:val="center"/>
-          </w:tcPr>
-          <w:p>
-            <w:pPr>
-              <w:spacing w:before="40" w:after="40" w:line="259" w:lineRule="auto"/>
-              <w:jc w:val="left"/>
-            </w:pPr>
-            <w:r>
-              <w:t xml:space="preserve">¿Qué decisiones se toman en el camino? ¿Con qué regla?</w:t>
-            </w:r>
-          </w:p>
-        </w:tc>
-        <w:tc>
-          <w:tcPr>
-            <w:tcW w:w="3090" w:type="dxa"/>
-            <w:vAlign w:val="center"/>
-          </w:tcPr>
-          <w:p>
-            <w:pPr>
-              <w:spacing w:before="40" w:after="40" w:line="259" w:lineRule="auto"/>
-              <w:jc w:val="left"/>
-            </w:pPr>
-            <w:r>
-              <w:t xml:space="preserve">Flujo de pasos y criterios</w:t>
-            </w:r>
-          </w:p>
-        </w:tc>
-      </w:tr>
-      <w:tr>
-        <w:trPr>
-          <w:cantSplit/>
-        </w:trPr>
-        <w:tc>
-          <w:tcPr>
-            <w:tcW w:w="662" w:type="dxa"/>
-            <w:vAlign w:val="center"/>
-          </w:tcPr>
-          <w:p>
-            <w:pPr>
-              <w:spacing w:before="40" w:after="40" w:line="259" w:lineRule="auto"/>
-              <w:jc w:val="left"/>
-            </w:pPr>
-            <w:r>
-              <w:t xml:space="preserve">6.5</w:t>
-            </w:r>
-          </w:p>
-        </w:tc>
-        <w:tc>
-          <w:tcPr>
-            <w:tcW w:w="5076" w:type="dxa"/>
-            <w:vAlign w:val="center"/>
-          </w:tcPr>
-          <w:p>
-            <w:pPr>
-              <w:spacing w:before="40" w:after="40" w:line="259" w:lineRule="auto"/>
-              <w:jc w:val="left"/>
-            </w:pPr>
-            <w:r>
-              <w:t xml:space="preserve">¿Cuál es el resultado final esperado y dónde queda registrado?</w:t>
-            </w:r>
-          </w:p>
-        </w:tc>
-        <w:tc>
-          <w:tcPr>
-            <w:tcW w:w="3090" w:type="dxa"/>
-            <w:vAlign w:val="center"/>
-          </w:tcPr>
-          <w:p>
-            <w:pPr>
-              <w:spacing w:before="40" w:after="40" w:line="259" w:lineRule="auto"/>
-              <w:jc w:val="left"/>
-            </w:pPr>
-            <w:r>
-              <w:t xml:space="preserve">Resultado esperado</w:t>
-            </w:r>
-          </w:p>
-        </w:tc>
-      </w:tr>
-      <w:tr>
-        <w:trPr>
-          <w:cantSplit/>
-        </w:trPr>
-        <w:tc>
-          <w:tcPr>
-            <w:tcW w:w="662" w:type="dxa"/>
-            <w:vAlign w:val="center"/>
-          </w:tcPr>
-          <w:p>
-            <w:pPr>
-              <w:spacing w:before="40" w:after="40" w:line="259" w:lineRule="auto"/>
-              <w:jc w:val="left"/>
-            </w:pPr>
-            <w:r>
-              <w:t xml:space="preserve">6.6</w:t>
-            </w:r>
-          </w:p>
-        </w:tc>
-        <w:tc>
-          <w:tcPr>
-            <w:tcW w:w="5076" w:type="dxa"/>
-            <w:vAlign w:val="center"/>
-          </w:tcPr>
-          <w:p>
-            <w:pPr>
-              <w:spacing w:before="40" w:after="40" w:line="259" w:lineRule="auto"/>
-              <w:jc w:val="left"/>
-            </w:pPr>
-            <w:r>
-              <w:t xml:space="preserve">¿Qué excepciones o casos raros ocurren? ¿Cómo se resuelven hoy?</w:t>
-            </w:r>
-          </w:p>
-        </w:tc>
-        <w:tc>
-          <w:tcPr>
-            <w:tcW w:w="3090" w:type="dxa"/>
-            <w:vAlign w:val="center"/>
-          </w:tcPr>
-          <w:p>
-            <w:pPr>
-              <w:spacing w:before="40" w:after="40" w:line="259" w:lineRule="auto"/>
-              <w:jc w:val="left"/>
-            </w:pPr>
-            <w:r>
-              <w:t xml:space="preserve">Casos de uso adicionales o fuera de alcance</w:t>
-            </w:r>
-          </w:p>
-        </w:tc>
-      </w:tr>
-    </w:tbl>
-    <w:p/>
-    <w:p>
-      <w:pPr>
-        <w:pStyle w:val="Ttulo1"/>
-      </w:pPr>
-      <w:r>
-        <w:t xml:space="preserve">Alcance de la fase</w:t>
-      </w:r>
-    </w:p>
-    <w:p>
-      <w:r>
-        <w:t xml:space="preserve">Alimenta: </w:t>
-      </w:r>
-      <w:r>
-        <w:rPr>
-          <w:b/>
-          <w:bCs/>
-        </w:rPr>
-        <w:t xml:space="preserve">Alcance</w:t>
-      </w:r>
-      <w:r>
-        <w:t xml:space="preserve">, </w:t>
-      </w:r>
-      <w:r>
-        <w:rPr>
-          <w:b/>
-          <w:bCs/>
-        </w:rPr>
-        <w:t xml:space="preserve">Fuera de alcance</w:t>
-      </w:r>
-      <w:r>
-        <w:t xml:space="preserve"> y la puerta de viabilidad del pipeline.</w:t>
-      </w:r>
-    </w:p>
-    <w:tbl>
-      <w:tblPr>
-        <w:tblStyle w:val="TablaSONDA"/>
-        <w:tblW w:w="8828" w:type="dxa"/>
-        <w:tblLayout w:type="fixed"/>
-        <w:tblLook w:val="0420" w:firstRow="1" w:lastRow="0" w:firstColumn="0" w:lastColumn="0" w:noHBand="0" w:noVBand="1"/>
-      </w:tblPr>
-      <w:tblGrid>
-        <w:gridCol w:w="662"/>
-        <w:gridCol w:w="5076"/>
-        <w:gridCol w:w="3090"/>
-      </w:tblGrid>
-      <w:tr>
-        <w:trPr>
-          <w:cnfStyle w:val="100000000000" w:firstRow="1" w:lastRow="0" w:firstColumn="0" w:lastColumn="0" w:oddVBand="0" w:evenVBand="0" w:oddHBand="0" w:evenHBand="0" w:firstRowFirstColumn="0" w:firstRowLastColumn="0" w:lastRowFirstColumn="0" w:lastRowLastColumn="0"/>
-          <w:tblHeader/>
-        </w:trPr>
-        <w:tc>
-          <w:tcPr>
-            <w:tcW w:w="662" w:type="dxa"/>
-            <w:vAlign w:val="center"/>
-          </w:tcPr>
-          <w:p>
-            <w:pPr>
-              <w:spacing w:before="40" w:after="40" w:line="259" w:lineRule="auto"/>
-              <w:jc w:val="center"/>
-            </w:pPr>
-            <w:r>
-              <w:t xml:space="preserve">N°</w:t>
-            </w:r>
-          </w:p>
-        </w:tc>
-        <w:tc>
-          <w:tcPr>
-            <w:tcW w:w="5076" w:type="dxa"/>
-            <w:vAlign w:val="center"/>
-          </w:tcPr>
-          <w:p>
-            <w:pPr>
-              <w:spacing w:before="40" w:after="40" w:line="259" w:lineRule="auto"/>
-              <w:jc w:val="center"/>
-            </w:pPr>
-            <w:r>
-              <w:t xml:space="preserve">Pregunta</w:t>
-            </w:r>
-          </w:p>
-        </w:tc>
-        <w:tc>
-          <w:tcPr>
-            <w:tcW w:w="3090" w:type="dxa"/>
-            <w:vAlign w:val="center"/>
-          </w:tcPr>
-          <w:p>
-            <w:pPr>
-              <w:spacing w:before="40" w:after="40" w:line="259" w:lineRule="auto"/>
-              <w:jc w:val="center"/>
-            </w:pPr>
-            <w:r>
-              <w:t xml:space="preserve">Para qué sirve</w:t>
-            </w:r>
-          </w:p>
-        </w:tc>
-      </w:tr>
-      <w:tr>
-        <w:trPr>
-          <w:cantSplit/>
-        </w:trPr>
-        <w:tc>
-          <w:tcPr>
-            <w:tcW w:w="662" w:type="dxa"/>
-            <w:vAlign w:val="center"/>
-          </w:tcPr>
-          <w:p>
-            <w:pPr>
-              <w:spacing w:before="40" w:after="40" w:line="259" w:lineRule="auto"/>
-              <w:jc w:val="left"/>
-            </w:pPr>
-            <w:r>
-              <w:t xml:space="preserve">7.1</w:t>
-            </w:r>
-          </w:p>
-        </w:tc>
-        <w:tc>
-          <w:tcPr>
-            <w:tcW w:w="5076" w:type="dxa"/>
-            <w:vAlign w:val="center"/>
-          </w:tcPr>
-          <w:p>
-            <w:pPr>
-              <w:spacing w:before="40" w:after="40" w:line="259" w:lineRule="auto"/>
-              <w:jc w:val="left"/>
-            </w:pPr>
-            <w:r>
-              <w:t xml:space="preserve">(clave) De todo lo conversado, ¿qué es indispensable para una primera fase?</w:t>
-            </w:r>
-          </w:p>
-        </w:tc>
-        <w:tc>
-          <w:tcPr>
-            <w:tcW w:w="3090" w:type="dxa"/>
-            <w:vAlign w:val="center"/>
-          </w:tcPr>
-          <w:p>
-            <w:pPr>
-              <w:spacing w:before="40" w:after="40" w:line="259" w:lineRule="auto"/>
-              <w:jc w:val="left"/>
-            </w:pPr>
-            <w:r>
-              <w:t xml:space="preserve">Casos viables</w:t>
-            </w:r>
-          </w:p>
-        </w:tc>
-      </w:tr>
-      <w:tr>
-        <w:trPr>
-          <w:cantSplit/>
-        </w:trPr>
-        <w:tc>
-          <w:tcPr>
-            <w:tcW w:w="662" w:type="dxa"/>
-            <w:vAlign w:val="center"/>
-          </w:tcPr>
-          <w:p>
-            <w:pPr>
-              <w:spacing w:before="40" w:after="40" w:line="259" w:lineRule="auto"/>
-              <w:jc w:val="left"/>
-            </w:pPr>
-            <w:r>
-              <w:t xml:space="preserve">7.2</w:t>
-            </w:r>
-          </w:p>
-        </w:tc>
-        <w:tc>
-          <w:tcPr>
-            <w:tcW w:w="5076" w:type="dxa"/>
-            <w:vAlign w:val="center"/>
-          </w:tcPr>
-          <w:p>
-            <w:pPr>
-              <w:spacing w:before="40" w:after="40" w:line="259" w:lineRule="auto"/>
-              <w:jc w:val="left"/>
-            </w:pPr>
-            <w:r>
-              <w:t xml:space="preserve">¿Qué puede esperar a una fase posterior?</w:t>
-            </w:r>
-          </w:p>
-        </w:tc>
-        <w:tc>
-          <w:tcPr>
-            <w:tcW w:w="3090" w:type="dxa"/>
-            <w:vAlign w:val="center"/>
-          </w:tcPr>
-          <w:p>
-            <w:pPr>
-              <w:spacing w:before="40" w:after="40" w:line="259" w:lineRule="auto"/>
-              <w:jc w:val="left"/>
-            </w:pPr>
-            <w:r>
-              <w:t xml:space="preserve">Fuera de alcance</w:t>
-            </w:r>
-          </w:p>
-        </w:tc>
-      </w:tr>
-      <w:tr>
-        <w:trPr>
-          <w:cantSplit/>
-        </w:trPr>
-        <w:tc>
-          <w:tcPr>
-            <w:tcW w:w="662" w:type="dxa"/>
-            <w:vAlign w:val="center"/>
-          </w:tcPr>
-          <w:p>
-            <w:pPr>
-              <w:spacing w:before="40" w:after="40" w:line="259" w:lineRule="auto"/>
-              <w:jc w:val="left"/>
-            </w:pPr>
-            <w:r>
-              <w:t xml:space="preserve">7.3</w:t>
-            </w:r>
-          </w:p>
-        </w:tc>
-        <w:tc>
-          <w:tcPr>
-            <w:tcW w:w="5076" w:type="dxa"/>
-            <w:vAlign w:val="center"/>
-          </w:tcPr>
-          <w:p>
-            <w:pPr>
-              <w:spacing w:before="40" w:after="40" w:line="259" w:lineRule="auto"/>
-              <w:jc w:val="left"/>
-            </w:pPr>
-            <w:r>
-              <w:t xml:space="preserve">¿Hay algo que definitivamente no se debe automatizar? ¿Por qué?</w:t>
-            </w:r>
-          </w:p>
-        </w:tc>
-        <w:tc>
-          <w:tcPr>
-            <w:tcW w:w="3090" w:type="dxa"/>
-            <w:vAlign w:val="center"/>
-          </w:tcPr>
-          <w:p>
-            <w:pPr>
-              <w:spacing w:before="40" w:after="40" w:line="259" w:lineRule="auto"/>
-              <w:jc w:val="left"/>
-            </w:pPr>
-            <w:r>
-              <w:t xml:space="preserve">Fuera de alcance con justificación</w:t>
-            </w:r>
-          </w:p>
-        </w:tc>
-      </w:tr>
-      <w:tr>
-        <w:trPr>
-          <w:cantSplit/>
-        </w:trPr>
-        <w:tc>
-          <w:tcPr>
-            <w:tcW w:w="662" w:type="dxa"/>
-            <w:vAlign w:val="center"/>
-          </w:tcPr>
-          <w:p>
-            <w:pPr>
-              <w:spacing w:before="40" w:after="40" w:line="259" w:lineRule="auto"/>
-              <w:jc w:val="left"/>
-            </w:pPr>
-            <w:r>
-              <w:t xml:space="preserve">7.4</w:t>
-            </w:r>
-          </w:p>
-        </w:tc>
-        <w:tc>
-          <w:tcPr>
-            <w:tcW w:w="5076" w:type="dxa"/>
-            <w:vAlign w:val="center"/>
-          </w:tcPr>
-          <w:p>
-            <w:pPr>
-              <w:spacing w:before="40" w:after="40" w:line="259" w:lineRule="auto"/>
-              <w:jc w:val="left"/>
-            </w:pPr>
-            <w:r>
-              <w:t xml:space="preserve">¿Existe una fecha o hito que condicione la entrega?</w:t>
-            </w:r>
-          </w:p>
-        </w:tc>
-        <w:tc>
-          <w:tcPr>
-            <w:tcW w:w="3090" w:type="dxa"/>
-            <w:vAlign w:val="center"/>
-          </w:tcPr>
-          <w:p>
-            <w:pPr>
-              <w:spacing w:before="40" w:after="40" w:line="259" w:lineRule="auto"/>
-              <w:jc w:val="left"/>
-            </w:pPr>
-            <w:r>
-              <w:t xml:space="preserve">Observaciones</w:t>
-            </w:r>
-          </w:p>
-        </w:tc>
-      </w:tr>
-    </w:tbl>
-    <w:p/>
-    <w:p>
-      <w:pPr>
-        <w:pStyle w:val="Ttulo1"/>
-      </w:pPr>
-      <w:r>
-        <w:t xml:space="preserve">Criterios de aceptación</w:t>
-      </w:r>
-    </w:p>
-    <w:p>
-      <w:r>
-        <w:t xml:space="preserve">Alimenta: </w:t>
-      </w:r>
-      <w:r>
-        <w:rPr>
-          <w:b/>
-          <w:bCs/>
-        </w:rPr>
-        <w:t xml:space="preserve">Historias de usuario</w:t>
-      </w:r>
-      <w:r>
-        <w:t xml:space="preserve"> (Como &lt;rol&gt;, quiero &lt;acción&gt; para &lt;beneficio&gt;) y sus criterios.</w:t>
-      </w:r>
-    </w:p>
-    <w:tbl>
-      <w:tblPr>
-        <w:tblStyle w:val="TablaSONDA"/>
-        <w:tblW w:w="8828" w:type="dxa"/>
-        <w:tblLayout w:type="fixed"/>
-        <w:tblLook w:val="0420" w:firstRow="1" w:lastRow="0" w:firstColumn="0" w:lastColumn="0" w:noHBand="0" w:noVBand="1"/>
-      </w:tblPr>
-      <w:tblGrid>
-        <w:gridCol w:w="662"/>
-        <w:gridCol w:w="5076"/>
-        <w:gridCol w:w="3090"/>
-      </w:tblGrid>
-      <w:tr>
-        <w:trPr>
-          <w:cnfStyle w:val="100000000000" w:firstRow="1" w:lastRow="0" w:firstColumn="0" w:lastColumn="0" w:oddVBand="0" w:evenVBand="0" w:oddHBand="0" w:evenHBand="0" w:firstRowFirstColumn="0" w:firstRowLastColumn="0" w:lastRowFirstColumn="0" w:lastRowLastColumn="0"/>
-          <w:tblHeader/>
-        </w:trPr>
-        <w:tc>
-          <w:tcPr>
-            <w:tcW w:w="662" w:type="dxa"/>
-            <w:vAlign w:val="center"/>
-          </w:tcPr>
-          <w:p>
-            <w:pPr>
-              <w:spacing w:before="40" w:after="40" w:line="259" w:lineRule="auto"/>
-              <w:jc w:val="center"/>
-            </w:pPr>
-            <w:r>
-              <w:t xml:space="preserve">N°</w:t>
-            </w:r>
-          </w:p>
-        </w:tc>
-        <w:tc>
-          <w:tcPr>
-            <w:tcW w:w="5076" w:type="dxa"/>
-            <w:vAlign w:val="center"/>
-          </w:tcPr>
-          <w:p>
-            <w:pPr>
-              <w:spacing w:before="40" w:after="40" w:line="259" w:lineRule="auto"/>
-              <w:jc w:val="center"/>
-            </w:pPr>
-            <w:r>
-              <w:t xml:space="preserve">Pregunta</w:t>
-            </w:r>
-          </w:p>
-        </w:tc>
-        <w:tc>
-          <w:tcPr>
-            <w:tcW w:w="3090" w:type="dxa"/>
-            <w:vAlign w:val="center"/>
-          </w:tcPr>
-          <w:p>
-            <w:pPr>
-              <w:spacing w:before="40" w:after="40" w:line="259" w:lineRule="auto"/>
-              <w:jc w:val="center"/>
-            </w:pPr>
-            <w:r>
-              <w:t xml:space="preserve">Para qué sirve</w:t>
-            </w:r>
-          </w:p>
-        </w:tc>
-      </w:tr>
-      <w:tr>
-        <w:trPr>
-          <w:cantSplit/>
-        </w:trPr>
-        <w:tc>
-          <w:tcPr>
-            <w:tcW w:w="662" w:type="dxa"/>
-            <w:vAlign w:val="center"/>
-          </w:tcPr>
-          <w:p>
-            <w:pPr>
-              <w:spacing w:before="40" w:after="40" w:line="259" w:lineRule="auto"/>
-              <w:jc w:val="left"/>
-            </w:pPr>
-            <w:r>
-              <w:t xml:space="preserve">8.1</w:t>
-            </w:r>
-          </w:p>
-        </w:tc>
-        <w:tc>
-          <w:tcPr>
-            <w:tcW w:w="5076" w:type="dxa"/>
-            <w:vAlign w:val="center"/>
-          </w:tcPr>
-          <w:p>
-            <w:pPr>
-              <w:spacing w:before="40" w:after="40" w:line="259" w:lineRule="auto"/>
-              <w:jc w:val="left"/>
-            </w:pPr>
-            <w:r>
-              <w:t xml:space="preserve">¿Quiénes usarán o recibirán el resultado? (operador N1, N2, cliente, jefatura)</w:t>
-            </w:r>
-          </w:p>
-        </w:tc>
-        <w:tc>
-          <w:tcPr>
-            <w:tcW w:w="3090" w:type="dxa"/>
-            <w:vAlign w:val="center"/>
-          </w:tcPr>
-          <w:p>
-            <w:pPr>
-              <w:spacing w:before="40" w:after="40" w:line="259" w:lineRule="auto"/>
-              <w:jc w:val="left"/>
-            </w:pPr>
-            <w:r>
-              <w:t xml:space="preserve">Rol de cada historia</w:t>
-            </w:r>
-          </w:p>
-        </w:tc>
-      </w:tr>
-      <w:tr>
-        <w:trPr>
-          <w:cantSplit/>
-        </w:trPr>
-        <w:tc>
-          <w:tcPr>
-            <w:tcW w:w="662" w:type="dxa"/>
-            <w:vAlign w:val="center"/>
-          </w:tcPr>
-          <w:p>
-            <w:pPr>
-              <w:spacing w:before="40" w:after="40" w:line="259" w:lineRule="auto"/>
-              <w:jc w:val="left"/>
-            </w:pPr>
-            <w:r>
-              <w:t xml:space="preserve">8.2</w:t>
-            </w:r>
-          </w:p>
-        </w:tc>
-        <w:tc>
-          <w:tcPr>
-            <w:tcW w:w="5076" w:type="dxa"/>
-            <w:vAlign w:val="center"/>
-          </w:tcPr>
-          <w:p>
-            <w:pPr>
-              <w:spacing w:before="40" w:after="40" w:line="259" w:lineRule="auto"/>
-              <w:jc w:val="left"/>
-            </w:pPr>
-            <w:r>
-              <w:t xml:space="preserve">¿Qué necesita ver o recibir cada uno, y para qué?</w:t>
-            </w:r>
-          </w:p>
-        </w:tc>
-        <w:tc>
-          <w:tcPr>
-            <w:tcW w:w="3090" w:type="dxa"/>
-            <w:vAlign w:val="center"/>
-          </w:tcPr>
-          <w:p>
-            <w:pPr>
-              <w:spacing w:before="40" w:after="40" w:line="259" w:lineRule="auto"/>
-              <w:jc w:val="left"/>
-            </w:pPr>
-            <w:r>
-              <w:t xml:space="preserve">Acción y beneficio</w:t>
-            </w:r>
-          </w:p>
-        </w:tc>
-      </w:tr>
-      <w:tr>
-        <w:trPr>
-          <w:cantSplit/>
-        </w:trPr>
-        <w:tc>
-          <w:tcPr>
-            <w:tcW w:w="662" w:type="dxa"/>
-            <w:vAlign w:val="center"/>
-          </w:tcPr>
-          <w:p>
-            <w:pPr>
-              <w:spacing w:before="40" w:after="40" w:line="259" w:lineRule="auto"/>
-              <w:jc w:val="left"/>
-            </w:pPr>
-            <w:r>
-              <w:t xml:space="preserve">8.3</w:t>
-            </w:r>
-          </w:p>
-        </w:tc>
-        <w:tc>
-          <w:tcPr>
-            <w:tcW w:w="5076" w:type="dxa"/>
-            <w:vAlign w:val="center"/>
-          </w:tcPr>
-          <w:p>
-            <w:pPr>
-              <w:spacing w:before="40" w:after="40" w:line="259" w:lineRule="auto"/>
-              <w:jc w:val="left"/>
-            </w:pPr>
-            <w:r>
-              <w:t xml:space="preserve">¿Qué datos debe contener el resultado? (campos del ticket, del correo, del reporte)</w:t>
-            </w:r>
-          </w:p>
-        </w:tc>
-        <w:tc>
-          <w:tcPr>
-            <w:tcW w:w="3090" w:type="dxa"/>
-            <w:vAlign w:val="center"/>
-          </w:tcPr>
-          <w:p>
-            <w:pPr>
-              <w:spacing w:before="40" w:after="40" w:line="259" w:lineRule="auto"/>
-              <w:jc w:val="left"/>
-            </w:pPr>
-            <w:r>
-              <w:t xml:space="preserve">Criterios de aceptación</w:t>
-            </w:r>
-          </w:p>
-        </w:tc>
-      </w:tr>
-      <w:tr>
-        <w:trPr>
-          <w:cantSplit/>
-        </w:trPr>
-        <w:tc>
-          <w:tcPr>
-            <w:tcW w:w="662" w:type="dxa"/>
-            <w:vAlign w:val="center"/>
-          </w:tcPr>
-          <w:p>
-            <w:pPr>
-              <w:spacing w:before="40" w:after="40" w:line="259" w:lineRule="auto"/>
-              <w:jc w:val="left"/>
-            </w:pPr>
-            <w:r>
-              <w:t xml:space="preserve">8.4</w:t>
-            </w:r>
-          </w:p>
-        </w:tc>
-        <w:tc>
-          <w:tcPr>
-            <w:tcW w:w="5076" w:type="dxa"/>
-            <w:vAlign w:val="center"/>
-          </w:tcPr>
-          <w:p>
-            <w:pPr>
-              <w:spacing w:before="40" w:after="40" w:line="259" w:lineRule="auto"/>
-              <w:jc w:val="left"/>
-            </w:pPr>
-            <w:r>
-              <w:t xml:space="preserve">¿En cuánto tiempo debe ocurrir? ¿Con qué frecuencia?</w:t>
-            </w:r>
-          </w:p>
-        </w:tc>
-        <w:tc>
-          <w:tcPr>
-            <w:tcW w:w="3090" w:type="dxa"/>
-            <w:vAlign w:val="center"/>
-          </w:tcPr>
-          <w:p>
-            <w:pPr>
-              <w:spacing w:before="40" w:after="40" w:line="259" w:lineRule="auto"/>
-              <w:jc w:val="left"/>
-            </w:pPr>
-            <w:r>
-              <w:t xml:space="preserve">Criterios de aceptación</w:t>
-            </w:r>
-          </w:p>
-        </w:tc>
-      </w:tr>
-      <w:tr>
-        <w:trPr>
-          <w:cantSplit/>
-        </w:trPr>
-        <w:tc>
-          <w:tcPr>
-            <w:tcW w:w="662" w:type="dxa"/>
-            <w:vAlign w:val="center"/>
-          </w:tcPr>
-          <w:p>
-            <w:pPr>
-              <w:spacing w:before="40" w:after="40" w:line="259" w:lineRule="auto"/>
-              <w:jc w:val="left"/>
-            </w:pPr>
-            <w:r>
-              <w:t xml:space="preserve">8.5</w:t>
-            </w:r>
-          </w:p>
-        </w:tc>
-        <w:tc>
-          <w:tcPr>
-            <w:tcW w:w="5076" w:type="dxa"/>
-            <w:vAlign w:val="center"/>
-          </w:tcPr>
-          <w:p>
-            <w:pPr>
-              <w:spacing w:before="40" w:after="40" w:line="259" w:lineRule="auto"/>
-              <w:jc w:val="left"/>
-            </w:pPr>
-            <w:r>
-              <w:t xml:space="preserve">¿Qué no debe pasar nunca? (duplicados, datos incompletos, envíos fuera de horario)</w:t>
-            </w:r>
-          </w:p>
-        </w:tc>
-        <w:tc>
-          <w:tcPr>
-            <w:tcW w:w="3090" w:type="dxa"/>
-            <w:vAlign w:val="center"/>
-          </w:tcPr>
-          <w:p>
-            <w:pPr>
-              <w:spacing w:before="40" w:after="40" w:line="259" w:lineRule="auto"/>
-              <w:jc w:val="left"/>
-            </w:pPr>
-            <w:r>
-              <w:t xml:space="preserve">Criterios de aceptación</w:t>
-            </w:r>
-          </w:p>
-        </w:tc>
-      </w:tr>
-    </w:tbl>
-    <w:p/>
-    <w:p>
-      <w:pPr>
-        <w:pStyle w:val="Ttulo1"/>
-      </w:pPr>
-      <w:r>
-        <w:t xml:space="preserve">Accesos, conectividad y prerrequisitos</w:t>
-      </w:r>
-    </w:p>
-    <w:p>
-      <w:r>
-        <w:t xml:space="preserve">Alimenta: </w:t>
-      </w:r>
-      <w:r>
-        <w:rPr>
-          <w:b/>
-          <w:bCs/>
-        </w:rPr>
-        <w:t xml:space="preserve">Observaciones</w:t>
-      </w:r>
-      <w:r>
-        <w:t xml:space="preserve">, acotación técnica de cada caso y </w:t>
-      </w:r>
-      <w:r>
-        <w:rPr>
-          <w:b/>
-          <w:bCs/>
-        </w:rPr>
-        <w:t xml:space="preserve">Complejidad Técnica</w:t>
-      </w:r>
-      <w:r>
-        <w:t xml:space="preserve">.</w:t>
-      </w:r>
-    </w:p>
-    <w:tbl>
-      <w:tblPr>
-        <w:tblStyle w:val="TablaSONDA"/>
-        <w:tblW w:w="8828" w:type="dxa"/>
-        <w:tblLayout w:type="fixed"/>
-        <w:tblLook w:val="0420" w:firstRow="1" w:lastRow="0" w:firstColumn="0" w:lastColumn="0" w:noHBand="0" w:noVBand="1"/>
-      </w:tblPr>
-      <w:tblGrid>
-        <w:gridCol w:w="662"/>
-        <w:gridCol w:w="5076"/>
-        <w:gridCol w:w="3090"/>
-      </w:tblGrid>
-      <w:tr>
-        <w:trPr>
-          <w:cnfStyle w:val="100000000000" w:firstRow="1" w:lastRow="0" w:firstColumn="0" w:lastColumn="0" w:oddVBand="0" w:evenVBand="0" w:oddHBand="0" w:evenHBand="0" w:firstRowFirstColumn="0" w:firstRowLastColumn="0" w:lastRowFirstColumn="0" w:lastRowLastColumn="0"/>
-          <w:tblHeader/>
-        </w:trPr>
-        <w:tc>
-          <w:tcPr>
-            <w:tcW w:w="662" w:type="dxa"/>
-            <w:vAlign w:val="center"/>
-          </w:tcPr>
-          <w:p>
-            <w:pPr>
-              <w:spacing w:before="40" w:after="40" w:line="259" w:lineRule="auto"/>
-              <w:jc w:val="center"/>
-            </w:pPr>
-            <w:r>
-              <w:t xml:space="preserve">N°</w:t>
-            </w:r>
-          </w:p>
-        </w:tc>
-        <w:tc>
-          <w:tcPr>
-            <w:tcW w:w="5076" w:type="dxa"/>
-            <w:vAlign w:val="center"/>
-          </w:tcPr>
-          <w:p>
-            <w:pPr>
-              <w:spacing w:before="40" w:after="40" w:line="259" w:lineRule="auto"/>
-              <w:jc w:val="center"/>
-            </w:pPr>
-            <w:r>
-              <w:t xml:space="preserve">Pregunta</w:t>
-            </w:r>
-          </w:p>
-        </w:tc>
-        <w:tc>
-          <w:tcPr>
-            <w:tcW w:w="3090" w:type="dxa"/>
-            <w:vAlign w:val="center"/>
-          </w:tcPr>
-          <w:p>
-            <w:pPr>
-              <w:spacing w:before="40" w:after="40" w:line="259" w:lineRule="auto"/>
-              <w:jc w:val="center"/>
-            </w:pPr>
-            <w:r>
-              <w:t xml:space="preserve">Para qué sirve</w:t>
-            </w:r>
-          </w:p>
-        </w:tc>
-      </w:tr>
-      <w:tr>
-        <w:trPr>
-          <w:cantSplit/>
-        </w:trPr>
-        <w:tc>
-          <w:tcPr>
-            <w:tcW w:w="662" w:type="dxa"/>
-            <w:vAlign w:val="center"/>
-          </w:tcPr>
-          <w:p>
-            <w:pPr>
-              <w:spacing w:before="40" w:after="40" w:line="259" w:lineRule="auto"/>
-              <w:jc w:val="left"/>
-            </w:pPr>
-            <w:r>
-              <w:t xml:space="preserve">9.1</w:t>
-            </w:r>
-          </w:p>
-        </w:tc>
-        <w:tc>
-          <w:tcPr>
-            <w:tcW w:w="5076" w:type="dxa"/>
-            <w:vAlign w:val="center"/>
-          </w:tcPr>
-          <w:p>
-            <w:pPr>
-              <w:spacing w:before="40" w:after="40" w:line="259" w:lineRule="auto"/>
-              <w:jc w:val="left"/>
-            </w:pPr>
-            <w:r>
-              <w:t xml:space="preserve">(clave) ¿Los sistemas tienen API, base de datos, CLI o solo interfaz gráfica?</w:t>
-            </w:r>
-          </w:p>
-        </w:tc>
-        <w:tc>
-          <w:tcPr>
-            <w:tcW w:w="3090" w:type="dxa"/>
-            <w:vAlign w:val="center"/>
-          </w:tcPr>
-          <w:p>
-            <w:pPr>
-              <w:spacing w:before="40" w:after="40" w:line="259" w:lineRule="auto"/>
-              <w:jc w:val="left"/>
-            </w:pPr>
-            <w:r>
-              <w:t xml:space="preserve">Complejidad y acotación técnica</w:t>
-            </w:r>
-          </w:p>
-        </w:tc>
-      </w:tr>
-      <w:tr>
-        <w:trPr>
-          <w:cantSplit/>
-        </w:trPr>
-        <w:tc>
-          <w:tcPr>
-            <w:tcW w:w="662" w:type="dxa"/>
-            <w:vAlign w:val="center"/>
-          </w:tcPr>
-          <w:p>
-            <w:pPr>
-              <w:spacing w:before="40" w:after="40" w:line="259" w:lineRule="auto"/>
-              <w:jc w:val="left"/>
-            </w:pPr>
-            <w:r>
-              <w:t xml:space="preserve">9.2</w:t>
-            </w:r>
-          </w:p>
-        </w:tc>
-        <w:tc>
-          <w:tcPr>
-            <w:tcW w:w="5076" w:type="dxa"/>
-            <w:vAlign w:val="center"/>
-          </w:tcPr>
-          <w:p>
-            <w:pPr>
-              <w:spacing w:before="40" w:after="40" w:line="259" w:lineRule="auto"/>
-              <w:jc w:val="left"/>
-            </w:pPr>
-            <w:r>
-              <w:t xml:space="preserve">¿Qué usuarios o credenciales de servicio se necesitan? ¿Quién los otorga?</w:t>
-            </w:r>
-          </w:p>
-        </w:tc>
-        <w:tc>
-          <w:tcPr>
-            <w:tcW w:w="3090" w:type="dxa"/>
-            <w:vAlign w:val="center"/>
-          </w:tcPr>
-          <w:p>
-            <w:pPr>
-              <w:spacing w:before="40" w:after="40" w:line="259" w:lineRule="auto"/>
-              <w:jc w:val="left"/>
-            </w:pPr>
-            <w:r>
-              <w:t xml:space="preserve">Prerrequisitos de acceso</w:t>
-            </w:r>
-          </w:p>
-        </w:tc>
-      </w:tr>
-      <w:tr>
-        <w:trPr>
-          <w:cantSplit/>
-        </w:trPr>
-        <w:tc>
-          <w:tcPr>
-            <w:tcW w:w="662" w:type="dxa"/>
-            <w:vAlign w:val="center"/>
-          </w:tcPr>
-          <w:p>
-            <w:pPr>
-              <w:spacing w:before="40" w:after="40" w:line="259" w:lineRule="auto"/>
-              <w:jc w:val="left"/>
-            </w:pPr>
-            <w:r>
-              <w:t xml:space="preserve">9.3</w:t>
-            </w:r>
-          </w:p>
-        </w:tc>
-        <w:tc>
-          <w:tcPr>
-            <w:tcW w:w="5076" w:type="dxa"/>
-            <w:vAlign w:val="center"/>
-          </w:tcPr>
-          <w:p>
-            <w:pPr>
-              <w:spacing w:before="40" w:after="40" w:line="259" w:lineRule="auto"/>
-              <w:jc w:val="left"/>
-            </w:pPr>
-            <w:r>
-              <w:t xml:space="preserve">¿Se requieren permisos elevados (root, sudo, administrador)?</w:t>
-            </w:r>
-          </w:p>
-        </w:tc>
-        <w:tc>
-          <w:tcPr>
-            <w:tcW w:w="3090" w:type="dxa"/>
-            <w:vAlign w:val="center"/>
-          </w:tcPr>
-          <w:p>
-            <w:pPr>
-              <w:spacing w:before="40" w:after="40" w:line="259" w:lineRule="auto"/>
-              <w:jc w:val="left"/>
-            </w:pPr>
-            <w:r>
-              <w:t xml:space="preserve">Riesgo y complejidad</w:t>
-            </w:r>
-          </w:p>
-        </w:tc>
-      </w:tr>
-      <w:tr>
-        <w:trPr>
-          <w:cantSplit/>
-        </w:trPr>
-        <w:tc>
-          <w:tcPr>
-            <w:tcW w:w="662" w:type="dxa"/>
-            <w:vAlign w:val="center"/>
-          </w:tcPr>
-          <w:p>
-            <w:pPr>
-              <w:spacing w:before="40" w:after="40" w:line="259" w:lineRule="auto"/>
-              <w:jc w:val="left"/>
-            </w:pPr>
-            <w:r>
-              <w:t xml:space="preserve">9.4</w:t>
-            </w:r>
-          </w:p>
-        </w:tc>
-        <w:tc>
-          <w:tcPr>
-            <w:tcW w:w="5076" w:type="dxa"/>
-            <w:vAlign w:val="center"/>
-          </w:tcPr>
-          <w:p>
-            <w:pPr>
-              <w:spacing w:before="40" w:after="40" w:line="259" w:lineRule="auto"/>
-              <w:jc w:val="left"/>
-            </w:pPr>
-            <w:r>
-              <w:t xml:space="preserve">¿Qué puertos, firewalls o VPN hay entre los sistemas?</w:t>
-            </w:r>
-          </w:p>
-        </w:tc>
-        <w:tc>
-          <w:tcPr>
-            <w:tcW w:w="3090" w:type="dxa"/>
-            <w:vAlign w:val="center"/>
-          </w:tcPr>
-          <w:p>
-            <w:pPr>
-              <w:spacing w:before="40" w:after="40" w:line="259" w:lineRule="auto"/>
-              <w:jc w:val="left"/>
-            </w:pPr>
-            <w:r>
-              <w:t xml:space="preserve">Prerrequisitos de conectividad</w:t>
-            </w:r>
-          </w:p>
-        </w:tc>
-      </w:tr>
-      <w:tr>
-        <w:trPr>
-          <w:cantSplit/>
-        </w:trPr>
-        <w:tc>
-          <w:tcPr>
-            <w:tcW w:w="662" w:type="dxa"/>
-            <w:vAlign w:val="center"/>
-          </w:tcPr>
-          <w:p>
-            <w:pPr>
-              <w:spacing w:before="40" w:after="40" w:line="259" w:lineRule="auto"/>
-              <w:jc w:val="left"/>
-            </w:pPr>
-            <w:r>
-              <w:t xml:space="preserve">9.5</w:t>
-            </w:r>
-          </w:p>
-        </w:tc>
-        <w:tc>
-          <w:tcPr>
-            <w:tcW w:w="5076" w:type="dxa"/>
-            <w:vAlign w:val="center"/>
-          </w:tcPr>
-          <w:p>
-            <w:pPr>
-              <w:spacing w:before="40" w:after="40" w:line="259" w:lineRule="auto"/>
-              <w:jc w:val="left"/>
-            </w:pPr>
-            <w:r>
-              <w:t xml:space="preserve">¿Dónde se ejecutaría la automatización? (servidor existente, nuevo, nube)</w:t>
-            </w:r>
-          </w:p>
-        </w:tc>
-        <w:tc>
-          <w:tcPr>
-            <w:tcW w:w="3090" w:type="dxa"/>
-            <w:vAlign w:val="center"/>
-          </w:tcPr>
-          <w:p>
-            <w:pPr>
-              <w:spacing w:before="40" w:after="40" w:line="259" w:lineRule="auto"/>
-              <w:jc w:val="left"/>
-            </w:pPr>
-            <w:r>
-              <w:t xml:space="preserve">Prerrequisitos</w:t>
-            </w:r>
-          </w:p>
-        </w:tc>
-      </w:tr>
-      <w:tr>
-        <w:trPr>
-          <w:cantSplit/>
-        </w:trPr>
-        <w:tc>
-          <w:tcPr>
-            <w:tcW w:w="662" w:type="dxa"/>
-            <w:vAlign w:val="center"/>
-          </w:tcPr>
-          <w:p>
-            <w:pPr>
-              <w:spacing w:before="40" w:after="40" w:line="259" w:lineRule="auto"/>
-              <w:jc w:val="left"/>
-            </w:pPr>
-            <w:r>
-              <w:t xml:space="preserve">9.6</w:t>
-            </w:r>
-          </w:p>
-        </w:tc>
-        <w:tc>
-          <w:tcPr>
-            <w:tcW w:w="5076" w:type="dxa"/>
-            <w:vAlign w:val="center"/>
-          </w:tcPr>
-          <w:p>
-            <w:pPr>
-              <w:spacing w:before="40" w:after="40" w:line="259" w:lineRule="auto"/>
-              <w:jc w:val="left"/>
-            </w:pPr>
-            <w:r>
-              <w:t xml:space="preserve">¿Hay ambiente de pruebas? ¿Cómo validamos sin afectar producción?</w:t>
-            </w:r>
-          </w:p>
-        </w:tc>
-        <w:tc>
-          <w:tcPr>
-            <w:tcW w:w="3090" w:type="dxa"/>
-            <w:vAlign w:val="center"/>
-          </w:tcPr>
-          <w:p>
-            <w:pPr>
-              <w:spacing w:before="40" w:after="40" w:line="259" w:lineRule="auto"/>
-              <w:jc w:val="left"/>
-            </w:pPr>
-            <w:r>
-              <w:t xml:space="preserve">Criterio de pruebas</w:t>
-            </w:r>
-          </w:p>
-        </w:tc>
-      </w:tr>
-    </w:tbl>
-    <w:p/>
-    <w:p>
-      <w:pPr>
-        <w:pStyle w:val="Ttulo1"/>
-      </w:pPr>
-      <w:r>
-        <w:t xml:space="preserve">Riesgo y manejo de fallas</w:t>
-      </w:r>
-    </w:p>
-    <w:p>
-      <w:r>
-        <w:t xml:space="preserve">Alimenta: </w:t>
-      </w:r>
-      <w:r>
-        <w:rPr>
-          <w:b/>
-          <w:bCs/>
-        </w:rPr>
-        <w:t xml:space="preserve">Riesgo Operativo</w:t>
-      </w:r>
-      <w:r>
-        <w:t xml:space="preserve"> (riesgo de NO automatizar) y la gestión de contingencia.</w:t>
-      </w:r>
-    </w:p>
-    <w:tbl>
-      <w:tblPr>
-        <w:tblStyle w:val="TablaSONDA"/>
-        <w:tblW w:w="8828" w:type="dxa"/>
-        <w:tblLayout w:type="fixed"/>
-        <w:tblLook w:val="0420" w:firstRow="1" w:lastRow="0" w:firstColumn="0" w:lastColumn="0" w:noHBand="0" w:noVBand="1"/>
-      </w:tblPr>
-      <w:tblGrid>
-        <w:gridCol w:w="662"/>
-        <w:gridCol w:w="5076"/>
-        <w:gridCol w:w="3090"/>
-      </w:tblGrid>
-      <w:tr>
-        <w:trPr>
-          <w:cnfStyle w:val="100000000000" w:firstRow="1" w:lastRow="0" w:firstColumn="0" w:lastColumn="0" w:oddVBand="0" w:evenVBand="0" w:oddHBand="0" w:evenHBand="0" w:firstRowFirstColumn="0" w:firstRowLastColumn="0" w:lastRowFirstColumn="0" w:lastRowLastColumn="0"/>
-          <w:tblHeader/>
-        </w:trPr>
-        <w:tc>
-          <w:tcPr>
-            <w:tcW w:w="662" w:type="dxa"/>
-            <w:vAlign w:val="center"/>
-          </w:tcPr>
-          <w:p>
-            <w:pPr>
-              <w:spacing w:before="40" w:after="40" w:line="259" w:lineRule="auto"/>
-              <w:jc w:val="center"/>
-            </w:pPr>
-            <w:r>
-              <w:t xml:space="preserve">N°</w:t>
-            </w:r>
-          </w:p>
-        </w:tc>
-        <w:tc>
-          <w:tcPr>
-            <w:tcW w:w="5076" w:type="dxa"/>
-            <w:vAlign w:val="center"/>
-          </w:tcPr>
-          <w:p>
-            <w:pPr>
-              <w:spacing w:before="40" w:after="40" w:line="259" w:lineRule="auto"/>
-              <w:jc w:val="center"/>
-            </w:pPr>
-            <w:r>
-              <w:t xml:space="preserve">Pregunta</w:t>
-            </w:r>
-          </w:p>
-        </w:tc>
-        <w:tc>
-          <w:tcPr>
-            <w:tcW w:w="3090" w:type="dxa"/>
-            <w:vAlign w:val="center"/>
-          </w:tcPr>
-          <w:p>
-            <w:pPr>
-              <w:spacing w:before="40" w:after="40" w:line="259" w:lineRule="auto"/>
-              <w:jc w:val="center"/>
-            </w:pPr>
-            <w:r>
-              <w:t xml:space="preserve">Para qué sirve</w:t>
-            </w:r>
-          </w:p>
-        </w:tc>
-      </w:tr>
-      <w:tr>
-        <w:trPr>
-          <w:cantSplit/>
-        </w:trPr>
-        <w:tc>
-          <w:tcPr>
-            <w:tcW w:w="662" w:type="dxa"/>
-            <w:vAlign w:val="center"/>
-          </w:tcPr>
-          <w:p>
-            <w:pPr>
-              <w:spacing w:before="40" w:after="40" w:line="259" w:lineRule="auto"/>
-              <w:jc w:val="left"/>
-            </w:pPr>
-            <w:r>
-              <w:t xml:space="preserve">10.1</w:t>
-            </w:r>
-          </w:p>
-        </w:tc>
-        <w:tc>
-          <w:tcPr>
-            <w:tcW w:w="5076" w:type="dxa"/>
-            <w:vAlign w:val="center"/>
-          </w:tcPr>
-          <w:p>
-            <w:pPr>
-              <w:spacing w:before="40" w:after="40" w:line="259" w:lineRule="auto"/>
-              <w:jc w:val="left"/>
-            </w:pPr>
-            <w:r>
-              <w:t xml:space="preserve">(clave) ¿Qué errores humanos ocurren hoy en esta tarea? ¿Con qué frecuencia?</w:t>
-            </w:r>
-          </w:p>
-        </w:tc>
-        <w:tc>
-          <w:tcPr>
-            <w:tcW w:w="3090" w:type="dxa"/>
-            <w:vAlign w:val="center"/>
-          </w:tcPr>
-          <w:p>
-            <w:pPr>
-              <w:spacing w:before="40" w:after="40" w:line="259" w:lineRule="auto"/>
-              <w:jc w:val="left"/>
-            </w:pPr>
-            <w:r>
-              <w:t xml:space="preserve">Riesgo Operativo</w:t>
-            </w:r>
-          </w:p>
-        </w:tc>
-      </w:tr>
-      <w:tr>
-        <w:trPr>
-          <w:cantSplit/>
-        </w:trPr>
-        <w:tc>
-          <w:tcPr>
-            <w:tcW w:w="662" w:type="dxa"/>
-            <w:vAlign w:val="center"/>
-          </w:tcPr>
-          <w:p>
-            <w:pPr>
-              <w:spacing w:before="40" w:after="40" w:line="259" w:lineRule="auto"/>
-              <w:jc w:val="left"/>
-            </w:pPr>
-            <w:r>
-              <w:t xml:space="preserve">10.2</w:t>
-            </w:r>
-          </w:p>
-        </w:tc>
-        <w:tc>
-          <w:tcPr>
-            <w:tcW w:w="5076" w:type="dxa"/>
-            <w:vAlign w:val="center"/>
-          </w:tcPr>
-          <w:p>
-            <w:pPr>
-              <w:spacing w:before="40" w:after="40" w:line="259" w:lineRule="auto"/>
-              <w:jc w:val="left"/>
-            </w:pPr>
-            <w:r>
-              <w:t xml:space="preserve">¿Tiene impacto en cumplimiento, auditoría o contratos?</w:t>
-            </w:r>
-          </w:p>
-        </w:tc>
-        <w:tc>
-          <w:tcPr>
-            <w:tcW w:w="3090" w:type="dxa"/>
-            <w:vAlign w:val="center"/>
-          </w:tcPr>
-          <w:p>
-            <w:pPr>
-              <w:spacing w:before="40" w:after="40" w:line="259" w:lineRule="auto"/>
-              <w:jc w:val="left"/>
-            </w:pPr>
-            <w:r>
-              <w:t xml:space="preserve">Riesgo Operativo</w:t>
-            </w:r>
-          </w:p>
-        </w:tc>
-      </w:tr>
-      <w:tr>
-        <w:trPr>
-          <w:cantSplit/>
-        </w:trPr>
-        <w:tc>
-          <w:tcPr>
-            <w:tcW w:w="662" w:type="dxa"/>
-            <w:vAlign w:val="center"/>
-          </w:tcPr>
-          <w:p>
-            <w:pPr>
-              <w:spacing w:before="40" w:after="40" w:line="259" w:lineRule="auto"/>
-              <w:jc w:val="left"/>
-            </w:pPr>
-            <w:r>
-              <w:t xml:space="preserve">10.3</w:t>
-            </w:r>
-          </w:p>
-        </w:tc>
-        <w:tc>
-          <w:tcPr>
-            <w:tcW w:w="5076" w:type="dxa"/>
-            <w:vAlign w:val="center"/>
-          </w:tcPr>
-          <w:p>
-            <w:pPr>
-              <w:spacing w:before="40" w:after="40" w:line="259" w:lineRule="auto"/>
-              <w:jc w:val="left"/>
-            </w:pPr>
-            <w:r>
-              <w:t xml:space="preserve">¿Depende de una o pocas personas clave?</w:t>
-            </w:r>
-          </w:p>
-        </w:tc>
-        <w:tc>
-          <w:tcPr>
-            <w:tcW w:w="3090" w:type="dxa"/>
-            <w:vAlign w:val="center"/>
-          </w:tcPr>
-          <w:p>
-            <w:pPr>
-              <w:spacing w:before="40" w:after="40" w:line="259" w:lineRule="auto"/>
-              <w:jc w:val="left"/>
-            </w:pPr>
-            <w:r>
-              <w:t xml:space="preserve">Riesgo Operativo</w:t>
-            </w:r>
-          </w:p>
-        </w:tc>
-      </w:tr>
-      <w:tr>
-        <w:trPr>
-          <w:cantSplit/>
-        </w:trPr>
-        <w:tc>
-          <w:tcPr>
-            <w:tcW w:w="662" w:type="dxa"/>
-            <w:vAlign w:val="center"/>
-          </w:tcPr>
-          <w:p>
-            <w:pPr>
-              <w:spacing w:before="40" w:after="40" w:line="259" w:lineRule="auto"/>
-              <w:jc w:val="left"/>
-            </w:pPr>
-            <w:r>
-              <w:t xml:space="preserve">10.4</w:t>
-            </w:r>
-          </w:p>
-        </w:tc>
-        <w:tc>
-          <w:tcPr>
-            <w:tcW w:w="5076" w:type="dxa"/>
-            <w:vAlign w:val="center"/>
-          </w:tcPr>
-          <w:p>
-            <w:pPr>
-              <w:spacing w:before="40" w:after="40" w:line="259" w:lineRule="auto"/>
-              <w:jc w:val="left"/>
-            </w:pPr>
-            <w:r>
-              <w:t xml:space="preserve">Si la automatización falla, ¿qué debe pasar? ¿Volver al proceso manual?</w:t>
-            </w:r>
-          </w:p>
-        </w:tc>
-        <w:tc>
-          <w:tcPr>
-            <w:tcW w:w="3090" w:type="dxa"/>
-            <w:vAlign w:val="center"/>
-          </w:tcPr>
-          <w:p>
-            <w:pPr>
-              <w:spacing w:before="40" w:after="40" w:line="259" w:lineRule="auto"/>
-              <w:jc w:val="left"/>
-            </w:pPr>
-            <w:r>
-              <w:t xml:space="preserve">Contingencia</w:t>
-            </w:r>
-          </w:p>
-        </w:tc>
-      </w:tr>
-      <w:tr>
-        <w:trPr>
-          <w:cantSplit/>
-        </w:trPr>
-        <w:tc>
-          <w:tcPr>
-            <w:tcW w:w="662" w:type="dxa"/>
-            <w:vAlign w:val="center"/>
-          </w:tcPr>
-          <w:p>
-            <w:pPr>
-              <w:spacing w:before="40" w:after="40" w:line="259" w:lineRule="auto"/>
-              <w:jc w:val="left"/>
-            </w:pPr>
-            <w:r>
-              <w:t xml:space="preserve">10.5</w:t>
-            </w:r>
-          </w:p>
-        </w:tc>
-        <w:tc>
-          <w:tcPr>
-            <w:tcW w:w="5076" w:type="dxa"/>
-            <w:vAlign w:val="center"/>
-          </w:tcPr>
-          <w:p>
-            <w:pPr>
-              <w:spacing w:before="40" w:after="40" w:line="259" w:lineRule="auto"/>
-              <w:jc w:val="left"/>
-            </w:pPr>
-            <w:r>
-              <w:t xml:space="preserve">¿A quién y por qué canal se notifica un error? (correo, Teams, ticket)</w:t>
-            </w:r>
-          </w:p>
-        </w:tc>
-        <w:tc>
-          <w:tcPr>
-            <w:tcW w:w="3090" w:type="dxa"/>
-            <w:vAlign w:val="center"/>
-          </w:tcPr>
-          <w:p>
-            <w:pPr>
-              <w:spacing w:before="40" w:after="40" w:line="259" w:lineRule="auto"/>
-              <w:jc w:val="left"/>
-            </w:pPr>
-            <w:r>
-              <w:t xml:space="preserve">Canal de notificación</w:t>
-            </w:r>
-          </w:p>
-        </w:tc>
-      </w:tr>
-    </w:tbl>
-    <w:p/>
-    <w:p>
-      <w:pPr>
-        <w:pStyle w:val="Ttulo1"/>
-      </w:pPr>
-      <w:r>
-        <w:t xml:space="preserve">Escalabilidad y alineamiento</w:t>
-      </w:r>
-    </w:p>
-    <w:p>
-      <w:r>
-        <w:t xml:space="preserve">Alimenta: </w:t>
-      </w:r>
-      <w:r>
-        <w:rPr>
-          <w:b/>
-          <w:bCs/>
-        </w:rPr>
-        <w:t xml:space="preserve">Escalabilidad / Reutilización</w:t>
-      </w:r>
-      <w:r>
-        <w:t xml:space="preserve"> y </w:t>
-      </w:r>
-      <w:r>
-        <w:rPr>
-          <w:b/>
-          <w:bCs/>
-        </w:rPr>
-        <w:t xml:space="preserve">Alineamiento Estratégico</w:t>
-      </w:r>
-      <w:r>
-        <w:t xml:space="preserve">.</w:t>
-      </w:r>
-    </w:p>
-    <w:tbl>
-      <w:tblPr>
-        <w:tblStyle w:val="TablaSONDA"/>
-        <w:tblW w:w="8828" w:type="dxa"/>
-        <w:tblLayout w:type="fixed"/>
-        <w:tblLook w:val="0420" w:firstRow="1" w:lastRow="0" w:firstColumn="0" w:lastColumn="0" w:noHBand="0" w:noVBand="1"/>
-      </w:tblPr>
-      <w:tblGrid>
-        <w:gridCol w:w="662"/>
-        <w:gridCol w:w="5076"/>
-        <w:gridCol w:w="3090"/>
-      </w:tblGrid>
-      <w:tr>
-        <w:trPr>
-          <w:cnfStyle w:val="100000000000" w:firstRow="1" w:lastRow="0" w:firstColumn="0" w:lastColumn="0" w:oddVBand="0" w:evenVBand="0" w:oddHBand="0" w:evenHBand="0" w:firstRowFirstColumn="0" w:firstRowLastColumn="0" w:lastRowFirstColumn="0" w:lastRowLastColumn="0"/>
-          <w:tblHeader/>
-        </w:trPr>
-        <w:tc>
-          <w:tcPr>
-            <w:tcW w:w="662" w:type="dxa"/>
-            <w:vAlign w:val="center"/>
-          </w:tcPr>
-          <w:p>
-            <w:pPr>
-              <w:spacing w:before="40" w:after="40" w:line="259" w:lineRule="auto"/>
-              <w:jc w:val="center"/>
-            </w:pPr>
-            <w:r>
-              <w:t xml:space="preserve">N°</w:t>
-            </w:r>
-          </w:p>
-        </w:tc>
-        <w:tc>
-          <w:tcPr>
-            <w:tcW w:w="5076" w:type="dxa"/>
-            <w:vAlign w:val="center"/>
-          </w:tcPr>
-          <w:p>
-            <w:pPr>
-              <w:spacing w:before="40" w:after="40" w:line="259" w:lineRule="auto"/>
-              <w:jc w:val="center"/>
-            </w:pPr>
-            <w:r>
-              <w:t xml:space="preserve">Pregunta</w:t>
-            </w:r>
-          </w:p>
-        </w:tc>
-        <w:tc>
-          <w:tcPr>
-            <w:tcW w:w="3090" w:type="dxa"/>
-            <w:vAlign w:val="center"/>
-          </w:tcPr>
-          <w:p>
-            <w:pPr>
-              <w:spacing w:before="40" w:after="40" w:line="259" w:lineRule="auto"/>
-              <w:jc w:val="center"/>
-            </w:pPr>
-            <w:r>
-              <w:t xml:space="preserve">Para qué sirve</w:t>
-            </w:r>
-          </w:p>
-        </w:tc>
-      </w:tr>
-      <w:tr>
-        <w:trPr>
-          <w:cantSplit/>
-        </w:trPr>
-        <w:tc>
-          <w:tcPr>
-            <w:tcW w:w="662" w:type="dxa"/>
-            <w:vAlign w:val="center"/>
-          </w:tcPr>
-          <w:p>
-            <w:pPr>
-              <w:spacing w:before="40" w:after="40" w:line="259" w:lineRule="auto"/>
-              <w:jc w:val="left"/>
-            </w:pPr>
-            <w:r>
-              <w:t xml:space="preserve">11.1</w:t>
-            </w:r>
-          </w:p>
-        </w:tc>
-        <w:tc>
-          <w:tcPr>
-            <w:tcW w:w="5076" w:type="dxa"/>
-            <w:vAlign w:val="center"/>
-          </w:tcPr>
-          <w:p>
-            <w:pPr>
-              <w:spacing w:before="40" w:after="40" w:line="259" w:lineRule="auto"/>
-              <w:jc w:val="left"/>
-            </w:pPr>
-            <w:r>
-              <w:t xml:space="preserve">(clave) ¿Este mismo proceso existe en otros equipos, países o filiales?</w:t>
-            </w:r>
-          </w:p>
-        </w:tc>
-        <w:tc>
-          <w:tcPr>
-            <w:tcW w:w="3090" w:type="dxa"/>
-            <w:vAlign w:val="center"/>
-          </w:tcPr>
-          <w:p>
-            <w:pPr>
-              <w:spacing w:before="40" w:after="40" w:line="259" w:lineRule="auto"/>
-              <w:jc w:val="left"/>
-            </w:pPr>
-            <w:r>
-              <w:t xml:space="preserve">Escalabilidad</w:t>
-            </w:r>
-          </w:p>
-        </w:tc>
-      </w:tr>
-      <w:tr>
-        <w:trPr>
-          <w:cantSplit/>
-        </w:trPr>
-        <w:tc>
-          <w:tcPr>
-            <w:tcW w:w="662" w:type="dxa"/>
-            <w:vAlign w:val="center"/>
-          </w:tcPr>
-          <w:p>
-            <w:pPr>
-              <w:spacing w:before="40" w:after="40" w:line="259" w:lineRule="auto"/>
-              <w:jc w:val="left"/>
-            </w:pPr>
-            <w:r>
-              <w:t xml:space="preserve">11.2</w:t>
-            </w:r>
-          </w:p>
-        </w:tc>
-        <w:tc>
-          <w:tcPr>
-            <w:tcW w:w="5076" w:type="dxa"/>
-            <w:vAlign w:val="center"/>
-          </w:tcPr>
-          <w:p>
-            <w:pPr>
-              <w:spacing w:before="40" w:after="40" w:line="259" w:lineRule="auto"/>
-              <w:jc w:val="left"/>
-            </w:pPr>
-            <w:r>
-              <w:t xml:space="preserve">¿Podría convertirse en un componente estándar o reutilizable?</w:t>
-            </w:r>
-          </w:p>
-        </w:tc>
-        <w:tc>
-          <w:tcPr>
-            <w:tcW w:w="3090" w:type="dxa"/>
-            <w:vAlign w:val="center"/>
-          </w:tcPr>
-          <w:p>
-            <w:pPr>
-              <w:spacing w:before="40" w:after="40" w:line="259" w:lineRule="auto"/>
-              <w:jc w:val="left"/>
-            </w:pPr>
-            <w:r>
-              <w:t xml:space="preserve">Escalabilidad</w:t>
-            </w:r>
-          </w:p>
-        </w:tc>
-      </w:tr>
-      <w:tr>
-        <w:trPr>
-          <w:cantSplit/>
-        </w:trPr>
-        <w:tc>
-          <w:tcPr>
-            <w:tcW w:w="662" w:type="dxa"/>
-            <w:vAlign w:val="center"/>
-          </w:tcPr>
-          <w:p>
-            <w:pPr>
-              <w:spacing w:before="40" w:after="40" w:line="259" w:lineRule="auto"/>
-              <w:jc w:val="left"/>
-            </w:pPr>
-            <w:r>
-              <w:t xml:space="preserve">11.3</w:t>
-            </w:r>
-          </w:p>
-        </w:tc>
-        <w:tc>
-          <w:tcPr>
-            <w:tcW w:w="5076" w:type="dxa"/>
-            <w:vAlign w:val="center"/>
-          </w:tcPr>
-          <w:p>
-            <w:pPr>
-              <w:spacing w:before="40" w:after="40" w:line="259" w:lineRule="auto"/>
-              <w:jc w:val="left"/>
-            </w:pPr>
-            <w:r>
-              <w:t xml:space="preserve">(clave) ¿Está en el roadmap de TI o apoya alguna iniciativa regional? (cloud, DevOps, seguridad, AIOps)</w:t>
-            </w:r>
-          </w:p>
-        </w:tc>
-        <w:tc>
-          <w:tcPr>
-            <w:tcW w:w="3090" w:type="dxa"/>
-            <w:vAlign w:val="center"/>
-          </w:tcPr>
-          <w:p>
-            <w:pPr>
-              <w:spacing w:before="40" w:after="40" w:line="259" w:lineRule="auto"/>
-              <w:jc w:val="left"/>
-            </w:pPr>
-            <w:r>
-              <w:t xml:space="preserve">Alineamiento Estratégico</w:t>
-            </w:r>
-          </w:p>
-        </w:tc>
-      </w:tr>
-      <w:tr>
-        <w:trPr>
-          <w:cantSplit/>
-        </w:trPr>
-        <w:tc>
-          <w:tcPr>
-            <w:tcW w:w="662" w:type="dxa"/>
-            <w:vAlign w:val="center"/>
-          </w:tcPr>
-          <w:p>
-            <w:pPr>
-              <w:spacing w:before="40" w:after="40" w:line="259" w:lineRule="auto"/>
-              <w:jc w:val="left"/>
-            </w:pPr>
-            <w:r>
-              <w:t xml:space="preserve">11.4</w:t>
-            </w:r>
-          </w:p>
-        </w:tc>
-        <w:tc>
-          <w:tcPr>
-            <w:tcW w:w="5076" w:type="dxa"/>
-            <w:vAlign w:val="center"/>
-          </w:tcPr>
-          <w:p>
-            <w:pPr>
-              <w:spacing w:before="40" w:after="40" w:line="259" w:lineRule="auto"/>
-              <w:jc w:val="left"/>
-            </w:pPr>
-            <w:r>
-              <w:t xml:space="preserve">¿Existe otra iniciativa similar en curso? ¿Cuál?</w:t>
-            </w:r>
-          </w:p>
-        </w:tc>
-        <w:tc>
-          <w:tcPr>
-            <w:tcW w:w="3090" w:type="dxa"/>
-            <w:vAlign w:val="center"/>
-          </w:tcPr>
-          <w:p>
-            <w:pPr>
-              <w:spacing w:before="40" w:after="40" w:line="259" w:lineRule="auto"/>
-              <w:jc w:val="left"/>
-            </w:pPr>
-            <w:r>
-              <w:t xml:space="preserve">Evitar duplicidad</w:t>
-            </w:r>
-          </w:p>
-        </w:tc>
-      </w:tr>
-    </w:tbl>
-    <w:p/>
-    <w:p>
-      <w:pPr>
-        <w:pStyle w:val="Ttulo1"/>
-      </w:pPr>
-      <w:r>
-        <w:t xml:space="preserve">Cierre de la reunión</w:t>
-      </w:r>
-    </w:p>
-    <w:p>
-      <w:r>
-        <w:t xml:space="preserve">Antes de terminar, el facilitador resume en voz alta para que quede en la transcripción:</w:t>
-      </w:r>
-    </w:p>
-    <w:p>
-      <w:pPr>
-        <w:pStyle w:val="Prrafodelista"/>
-        <w:numPr>
-          <w:ilvl w:val="0"/>
-          <w:numId w:val="22"/>
-        </w:numPr>
-      </w:pPr>
-      <w:r>
-        <w:t xml:space="preserve">Nomenclatura de la iniciativa.</w:t>
-      </w:r>
-    </w:p>
-    <w:p>
-      <w:pPr>
-        <w:pStyle w:val="Prrafodelista"/>
-        <w:numPr>
-          <w:ilvl w:val="0"/>
-          <w:numId w:val="22"/>
-        </w:numPr>
-      </w:pPr>
-      <w:r>
-        <w:t xml:space="preserve">Volumen mensual, minutos por ejecución y porcentaje automatizable.</w:t>
-      </w:r>
-    </w:p>
-    <w:p>
-      <w:pPr>
-        <w:pStyle w:val="Prrafodelista"/>
-        <w:numPr>
-          <w:ilvl w:val="0"/>
-          <w:numId w:val="22"/>
-        </w:numPr>
-      </w:pPr>
-      <w:r>
-        <w:t xml:space="preserve">Sistemas involucrados y casos de uso de la primera fase.</w:t>
-      </w:r>
-    </w:p>
-    <w:p>
-      <w:pPr>
-        <w:pStyle w:val="Prrafodelista"/>
-        <w:numPr>
-          <w:ilvl w:val="0"/>
-          <w:numId w:val="22"/>
-        </w:numPr>
-      </w:pPr>
-      <w:r>
-        <w:t xml:space="preserve">Accesos o prerrequisitos pendientes y quién los gestiona.</w:t>
-      </w:r>
-    </w:p>
-    <w:p>
-      <w:pPr>
-        <w:pStyle w:val="Prrafodelista"/>
-        <w:numPr>
-          <w:ilvl w:val="0"/>
-          <w:numId w:val="22"/>
-        </w:numPr>
-      </w:pPr>
-      <w:r>
-        <w:t xml:space="preserve">Próximos pasos y responsables.</w:t>
+        <w:t xml:space="preserve">Antes de cortar, resume en voz alta para que quede en la transcripción: los tres números de la pregunta 3, los sistemas, qué entra y qué queda fuera de la fase, y los accesos pendientes con su responsable.</w:t>
       </w:r>
     </w:p>
     <w:p>
@@ -4462,7 +1829,7 @@
         <w:t xml:space="preserve">Ejemplo:</w:t>
       </w:r>
       <w:r>
-        <w:t xml:space="preserve"> "Resumiendo: son unas 600 alertas al mes, cada una toma 10 minutos y se podría automatizar el 80 %. Intervienen Zabbix y Remedy. En esta fase entran la detección y la creación del ticket; el reinicio remoto queda fuera."</w:t>
+        <w:t xml:space="preserve"> "Resumiendo: son unas 600 alertas al mes, cada una toma 10 minutos y se podría automatizar el 80 %. Intervienen Zabbix y Remedy. En esta fase entran la detección y la creación del ticket; el reinicio remoto queda fuera. Falta el usuario de Remedy, lo pide Juan."</w:t>
       </w:r>
     </w:p>
     <w:p>
@@ -4470,24 +1837,7 @@
         <w:pStyle w:val="Ttulo1"/>
       </w:pPr>
       <w:r>
-        <w:t xml:space="preserve">Anexos</w:t>
-      </w:r>
-    </w:p>
-    <w:p>
-      <w:pPr>
-        <w:pStyle w:val="Ttulo2"/>
-        <w:numPr>
-          <w:ilvl w:val="1"/>
-          <w:numId w:val="1"/>
-        </w:numPr>
-      </w:pPr>
-      <w:r>
-        <w:t xml:space="preserve">Datos mínimos para el score CoE</w:t>
-      </w:r>
-    </w:p>
-    <w:p>
-      <w:r>
-        <w:t xml:space="preserve">Sin estos datos, la dimensión correspondiente queda como "No hay suficientes datos para establecer una calificación certera" y el score final queda pendiente.</w:t>
+        <w:t xml:space="preserve">Anexo: qué pregunta alimenta cada parte</w:t>
       </w:r>
     </w:p>
     <w:tbl>
@@ -4498,9 +1848,8 @@
         <w:tblLook w:val="0420" w:firstRow="1" w:lastRow="0" w:firstColumn="0" w:lastColumn="0" w:noHBand="0" w:noVBand="1"/>
       </w:tblPr>
       <w:tblGrid>
-        <w:gridCol w:w="3310"/>
-        <w:gridCol w:w="1104"/>
-        <w:gridCol w:w="4414"/>
+        <w:gridCol w:w="6069"/>
+        <w:gridCol w:w="2759"/>
       </w:tblGrid>
       <w:tr>
         <w:trPr>
@@ -4509,7 +1858,7 @@
         </w:trPr>
         <w:tc>
           <w:tcPr>
-            <w:tcW w:w="3310" w:type="dxa"/>
+            <w:tcW w:w="6069" w:type="dxa"/>
             <w:vAlign w:val="center"/>
           </w:tcPr>
           <w:p>
@@ -4518,13 +1867,13 @@
               <w:jc w:val="center"/>
             </w:pPr>
             <w:r>
-              <w:t xml:space="preserve">Dimensión</w:t>
+              <w:t xml:space="preserve">Documento o dimensión CoE</w:t>
             </w:r>
           </w:p>
         </w:tc>
         <w:tc>
           <w:tcPr>
-            <w:tcW w:w="1104" w:type="dxa"/>
+            <w:tcW w:w="2759" w:type="dxa"/>
             <w:vAlign w:val="center"/>
           </w:tcPr>
           <w:p>
@@ -4533,22 +1882,7 @@
               <w:jc w:val="center"/>
             </w:pPr>
             <w:r>
-              <w:t xml:space="preserve">Peso</w:t>
-            </w:r>
-          </w:p>
-        </w:tc>
-        <w:tc>
-          <w:tcPr>
-            <w:tcW w:w="4414" w:type="dxa"/>
-            <w:vAlign w:val="center"/>
-          </w:tcPr>
-          <w:p>
-            <w:pPr>
-              <w:spacing w:before="40" w:after="40" w:line="259" w:lineRule="auto"/>
-              <w:jc w:val="center"/>
-            </w:pPr>
-            <w:r>
-              <w:t xml:space="preserve">Preguntas clave</w:t>
+              <w:t xml:space="preserve">Preguntas</w:t>
             </w:r>
           </w:p>
         </w:tc>
@@ -4559,7 +1893,7 @@
         </w:trPr>
         <w:tc>
           <w:tcPr>
-            <w:tcW w:w="3310" w:type="dxa"/>
+            <w:tcW w:w="6069" w:type="dxa"/>
             <w:vAlign w:val="center"/>
           </w:tcPr>
           <w:p>
@@ -4568,13 +1902,13 @@
               <w:jc w:val="left"/>
             </w:pPr>
             <w:r>
-              <w:t xml:space="preserve">Impacto en Negocio</w:t>
+              <w:t xml:space="preserve">Contexto de la propuesta</w:t>
             </w:r>
           </w:p>
         </w:tc>
         <w:tc>
           <w:tcPr>
-            <w:tcW w:w="1104" w:type="dxa"/>
+            <w:tcW w:w="2759" w:type="dxa"/>
             <w:vAlign w:val="center"/>
           </w:tcPr>
           <w:p>
@@ -4583,22 +1917,7 @@
               <w:jc w:val="left"/>
             </w:pPr>
             <w:r>
-              <w:t xml:space="preserve">30 %</w:t>
-            </w:r>
-          </w:p>
-        </w:tc>
-        <w:tc>
-          <w:tcPr>
-            <w:tcW w:w="4414" w:type="dxa"/>
-            <w:vAlign w:val="center"/>
-          </w:tcPr>
-          <w:p>
-            <w:pPr>
-              <w:spacing w:before="40" w:after="40" w:line="259" w:lineRule="auto"/>
-              <w:jc w:val="left"/>
-            </w:pPr>
-            <w:r>
-              <w:t xml:space="preserve">3.1, 3.4</w:t>
+              <w:t xml:space="preserve">1, 2</w:t>
             </w:r>
           </w:p>
         </w:tc>
@@ -4609,7 +1928,7 @@
         </w:trPr>
         <w:tc>
           <w:tcPr>
-            <w:tcW w:w="3310" w:type="dxa"/>
+            <w:tcW w:w="6069" w:type="dxa"/>
             <w:vAlign w:val="center"/>
           </w:tcPr>
           <w:p>
@@ -4618,13 +1937,13 @@
               <w:jc w:val="left"/>
             </w:pPr>
             <w:r>
-              <w:t xml:space="preserve">Eficiencia Operativa</w:t>
+              <w:t xml:space="preserve">Objetivos, alcance y fuera de alcance</w:t>
             </w:r>
           </w:p>
         </w:tc>
         <w:tc>
           <w:tcPr>
-            <w:tcW w:w="1104" w:type="dxa"/>
+            <w:tcW w:w="2759" w:type="dxa"/>
             <w:vAlign w:val="center"/>
           </w:tcPr>
           <w:p>
@@ -4633,22 +1952,7 @@
               <w:jc w:val="left"/>
             </w:pPr>
             <w:r>
-              <w:t xml:space="preserve">20 %</w:t>
-            </w:r>
-          </w:p>
-        </w:tc>
-        <w:tc>
-          <w:tcPr>
-            <w:tcW w:w="4414" w:type="dxa"/>
-            <w:vAlign w:val="center"/>
-          </w:tcPr>
-          <w:p>
-            <w:pPr>
-              <w:spacing w:before="40" w:after="40" w:line="259" w:lineRule="auto"/>
-              <w:jc w:val="left"/>
-            </w:pPr>
-            <w:r>
-              <w:t xml:space="preserve">5.1, 5.2, 5.3</w:t>
+              <w:t xml:space="preserve">6</w:t>
             </w:r>
           </w:p>
         </w:tc>
@@ -4659,7 +1963,7 @@
         </w:trPr>
         <w:tc>
           <w:tcPr>
-            <w:tcW w:w="3310" w:type="dxa"/>
+            <w:tcW w:w="6069" w:type="dxa"/>
             <w:vAlign w:val="center"/>
           </w:tcPr>
           <w:p>
@@ -4668,13 +1972,13 @@
               <w:jc w:val="left"/>
             </w:pPr>
             <w:r>
-              <w:t xml:space="preserve">Riesgo Operativo</w:t>
+              <w:t xml:space="preserve">Casos de uso y diagrama de secuencia</w:t>
             </w:r>
           </w:p>
         </w:tc>
         <w:tc>
           <w:tcPr>
-            <w:tcW w:w="1104" w:type="dxa"/>
+            <w:tcW w:w="2759" w:type="dxa"/>
             <w:vAlign w:val="center"/>
           </w:tcPr>
           <w:p>
@@ -4683,22 +1987,7 @@
               <w:jc w:val="left"/>
             </w:pPr>
             <w:r>
-              <w:t xml:space="preserve">15 %</w:t>
-            </w:r>
-          </w:p>
-        </w:tc>
-        <w:tc>
-          <w:tcPr>
-            <w:tcW w:w="4414" w:type="dxa"/>
-            <w:vAlign w:val="center"/>
-          </w:tcPr>
-          <w:p>
-            <w:pPr>
-              <w:spacing w:before="40" w:after="40" w:line="259" w:lineRule="auto"/>
-              <w:jc w:val="left"/>
-            </w:pPr>
-            <w:r>
-              <w:t xml:space="preserve">10.1</w:t>
+              <w:t xml:space="preserve">4, 5</w:t>
             </w:r>
           </w:p>
         </w:tc>
@@ -4709,7 +1998,7 @@
         </w:trPr>
         <w:tc>
           <w:tcPr>
-            <w:tcW w:w="3310" w:type="dxa"/>
+            <w:tcW w:w="6069" w:type="dxa"/>
             <w:vAlign w:val="center"/>
           </w:tcPr>
           <w:p>
@@ -4718,13 +2007,13 @@
               <w:jc w:val="left"/>
             </w:pPr>
             <w:r>
-              <w:t xml:space="preserve">Escalabilidad / Reutilización</w:t>
+              <w:t xml:space="preserve">Historias de usuario y criterios de aceptación</w:t>
             </w:r>
           </w:p>
         </w:tc>
         <w:tc>
           <w:tcPr>
-            <w:tcW w:w="1104" w:type="dxa"/>
+            <w:tcW w:w="2759" w:type="dxa"/>
             <w:vAlign w:val="center"/>
           </w:tcPr>
           <w:p>
@@ -4733,22 +2022,7 @@
               <w:jc w:val="left"/>
             </w:pPr>
             <w:r>
-              <w:t xml:space="preserve">10 %</w:t>
-            </w:r>
-          </w:p>
-        </w:tc>
-        <w:tc>
-          <w:tcPr>
-            <w:tcW w:w="4414" w:type="dxa"/>
-            <w:vAlign w:val="center"/>
-          </w:tcPr>
-          <w:p>
-            <w:pPr>
-              <w:spacing w:before="40" w:after="40" w:line="259" w:lineRule="auto"/>
-              <w:jc w:val="left"/>
-            </w:pPr>
-            <w:r>
-              <w:t xml:space="preserve">11.1</w:t>
+              <w:t xml:space="preserve">7</w:t>
             </w:r>
           </w:p>
         </w:tc>
@@ -4759,7 +2033,7 @@
         </w:trPr>
         <w:tc>
           <w:tcPr>
-            <w:tcW w:w="3310" w:type="dxa"/>
+            <w:tcW w:w="6069" w:type="dxa"/>
             <w:vAlign w:val="center"/>
           </w:tcPr>
           <w:p>
@@ -4768,13 +2042,13 @@
               <w:jc w:val="left"/>
             </w:pPr>
             <w:r>
-              <w:t xml:space="preserve">Alineamiento Estratégico</w:t>
+              <w:t xml:space="preserve">Observaciones y prerrequisitos</w:t>
             </w:r>
           </w:p>
         </w:tc>
         <w:tc>
           <w:tcPr>
-            <w:tcW w:w="1104" w:type="dxa"/>
+            <w:tcW w:w="2759" w:type="dxa"/>
             <w:vAlign w:val="center"/>
           </w:tcPr>
           <w:p>
@@ -4783,22 +2057,7 @@
               <w:jc w:val="left"/>
             </w:pPr>
             <w:r>
-              <w:t xml:space="preserve">10 %</w:t>
-            </w:r>
-          </w:p>
-        </w:tc>
-        <w:tc>
-          <w:tcPr>
-            <w:tcW w:w="4414" w:type="dxa"/>
-            <w:vAlign w:val="center"/>
-          </w:tcPr>
-          <w:p>
-            <w:pPr>
-              <w:spacing w:before="40" w:after="40" w:line="259" w:lineRule="auto"/>
-              <w:jc w:val="left"/>
-            </w:pPr>
-            <w:r>
-              <w:t xml:space="preserve">11.3</w:t>
+              <w:t xml:space="preserve">8, 9</w:t>
             </w:r>
           </w:p>
         </w:tc>
@@ -4809,7 +2068,7 @@
         </w:trPr>
         <w:tc>
           <w:tcPr>
-            <w:tcW w:w="3310" w:type="dxa"/>
+            <w:tcW w:w="6069" w:type="dxa"/>
             <w:vAlign w:val="center"/>
           </w:tcPr>
           <w:p>
@@ -4818,13 +2077,13 @@
               <w:jc w:val="left"/>
             </w:pPr>
             <w:r>
-              <w:t xml:space="preserve">Complejidad Técnica (resta)</w:t>
+              <w:t xml:space="preserve">Impacto (30 %) y Riesgo (15 %)</w:t>
             </w:r>
           </w:p>
         </w:tc>
         <w:tc>
           <w:tcPr>
-            <w:tcW w:w="1104" w:type="dxa"/>
+            <w:tcW w:w="2759" w:type="dxa"/>
             <w:vAlign w:val="center"/>
           </w:tcPr>
           <w:p>
@@ -4833,13 +2092,18 @@
               <w:jc w:val="left"/>
             </w:pPr>
             <w:r>
-              <w:t xml:space="preserve">15 %</w:t>
+              <w:t xml:space="preserve">1, 2</w:t>
             </w:r>
           </w:p>
         </w:tc>
+      </w:tr>
+      <w:tr>
+        <w:trPr>
+          <w:cantSplit/>
+        </w:trPr>
         <w:tc>
           <w:tcPr>
-            <w:tcW w:w="4414" w:type="dxa"/>
+            <w:tcW w:w="6069" w:type="dxa"/>
             <w:vAlign w:val="center"/>
           </w:tcPr>
           <w:p>
@@ -4848,115 +2112,98 @@
               <w:jc w:val="left"/>
             </w:pPr>
             <w:r>
-              <w:t xml:space="preserve">6.1, 9.1</w:t>
+              <w:t xml:space="preserve">Eficiencia Operativa (20 %)</w:t>
+            </w:r>
+          </w:p>
+        </w:tc>
+        <w:tc>
+          <w:tcPr>
+            <w:tcW w:w="2759" w:type="dxa"/>
+            <w:vAlign w:val="center"/>
+          </w:tcPr>
+          <w:p>
+            <w:pPr>
+              <w:spacing w:before="40" w:after="40" w:line="259" w:lineRule="auto"/>
+              <w:jc w:val="left"/>
+            </w:pPr>
+            <w:r>
+              <w:t xml:space="preserve">3</w:t>
+            </w:r>
+          </w:p>
+        </w:tc>
+      </w:tr>
+      <w:tr>
+        <w:trPr>
+          <w:cantSplit/>
+        </w:trPr>
+        <w:tc>
+          <w:tcPr>
+            <w:tcW w:w="6069" w:type="dxa"/>
+            <w:vAlign w:val="center"/>
+          </w:tcPr>
+          <w:p>
+            <w:pPr>
+              <w:spacing w:before="40" w:after="40" w:line="259" w:lineRule="auto"/>
+              <w:jc w:val="left"/>
+            </w:pPr>
+            <w:r>
+              <w:t xml:space="preserve">Escalabilidad y Alineamiento (10 % c/u)</w:t>
+            </w:r>
+          </w:p>
+        </w:tc>
+        <w:tc>
+          <w:tcPr>
+            <w:tcW w:w="2759" w:type="dxa"/>
+            <w:vAlign w:val="center"/>
+          </w:tcPr>
+          <w:p>
+            <w:pPr>
+              <w:spacing w:before="40" w:after="40" w:line="259" w:lineRule="auto"/>
+              <w:jc w:val="left"/>
+            </w:pPr>
+            <w:r>
+              <w:t xml:space="preserve">10</w:t>
+            </w:r>
+          </w:p>
+        </w:tc>
+      </w:tr>
+      <w:tr>
+        <w:trPr>
+          <w:cantSplit/>
+        </w:trPr>
+        <w:tc>
+          <w:tcPr>
+            <w:tcW w:w="6069" w:type="dxa"/>
+            <w:vAlign w:val="center"/>
+          </w:tcPr>
+          <w:p>
+            <w:pPr>
+              <w:spacing w:before="40" w:after="40" w:line="259" w:lineRule="auto"/>
+              <w:jc w:val="left"/>
+            </w:pPr>
+            <w:r>
+              <w:t xml:space="preserve">Complejidad Técnica (15 %, resta)</w:t>
+            </w:r>
+          </w:p>
+        </w:tc>
+        <w:tc>
+          <w:tcPr>
+            <w:tcW w:w="2759" w:type="dxa"/>
+            <w:vAlign w:val="center"/>
+          </w:tcPr>
+          <w:p>
+            <w:pPr>
+              <w:spacing w:before="40" w:after="40" w:line="259" w:lineRule="auto"/>
+              <w:jc w:val="left"/>
+            </w:pPr>
+            <w:r>
+              <w:t xml:space="preserve">4, 8</w:t>
             </w:r>
           </w:p>
         </w:tc>
       </w:tr>
     </w:tbl>
     <w:p/>
-    <w:p>
-      <w:pPr>
-        <w:pStyle w:val="Ttulo2"/>
-        <w:numPr>
-          <w:ilvl w:val="1"/>
-          <w:numId w:val="1"/>
-        </w:numPr>
-      </w:pPr>
-      <w:r>
-        <w:t xml:space="preserve">Glosario de términos</w:t>
-      </w:r>
-    </w:p>
-    <w:p>
-      <w:pPr>
-        <w:keepNext/>
-        <w:spacing w:after="0"/>
-      </w:pPr>
-      <w:r>
-        <w:rPr>
-          <w:b/>
-          <w:bCs/>
-        </w:rPr>
-        <w:t xml:space="preserve">Caso de uso</w:t>
-      </w:r>
-    </w:p>
-    <w:p>
-      <w:r>
-        <w:t xml:space="preserve">Interacción concreta entre un actor y el sistema, con precondiciones, pasos y un resultado esperado.</w:t>
-      </w:r>
-    </w:p>
-    <w:p>
-      <w:pPr>
-        <w:keepNext/>
-        <w:spacing w:after="0"/>
-      </w:pPr>
-      <w:r>
-        <w:rPr>
-          <w:b/>
-          <w:bCs/>
-        </w:rPr>
-        <w:t xml:space="preserve">HH</w:t>
-      </w:r>
-    </w:p>
-    <w:p>
-      <w:r>
-        <w:t xml:space="preserve">Horas hombre: tiempo de trabajo de una persona.</w:t>
-      </w:r>
-    </w:p>
-    <w:p>
-      <w:pPr>
-        <w:keepNext/>
-        <w:spacing w:after="0"/>
-      </w:pPr>
-      <w:r>
-        <w:rPr>
-          <w:b/>
-          <w:bCs/>
-        </w:rPr>
-        <w:t xml:space="preserve">Historia de usuario</w:t>
-      </w:r>
-    </w:p>
-    <w:p>
-      <w:r>
-        <w:t xml:space="preserve">Necesidad expresada como "Como &lt;rol&gt;, quiero &lt;acción&gt; para &lt;beneficio&gt;", con criterios de aceptación.</w:t>
-      </w:r>
-    </w:p>
-    <w:p>
-      <w:pPr>
-        <w:keepNext/>
-        <w:spacing w:after="0"/>
-      </w:pPr>
-      <w:r>
-        <w:rPr>
-          <w:b/>
-          <w:bCs/>
-        </w:rPr>
-        <w:t xml:space="preserve">Score CoE</w:t>
-      </w:r>
-    </w:p>
-    <w:p>
-      <w:r>
-        <w:t xml:space="preserve">Puntaje ponderado de 6 dimensiones que define la prioridad de la iniciativa.</w:t>
-      </w:r>
-    </w:p>
-    <w:p>
-      <w:pPr>
-        <w:keepNext/>
-        <w:spacing w:after="0"/>
-      </w:pPr>
-      <w:r>
-        <w:rPr>
-          <w:b/>
-          <w:bCs/>
-        </w:rPr>
-        <w:t xml:space="preserve">Transcripción</w:t>
-      </w:r>
-    </w:p>
-    <w:p>
-      <w:r>
-        <w:t xml:space="preserve">Texto de la reunión generado por Teams, que es el insumo del pipeline.</w:t>
-      </w:r>
-    </w:p>
     <w:sectPr>
       <w:footerReference w:type="default" r:id="rId38"/>
       <w:footerReference w:type="first" r:id="rId39"/>
@@ -5700,7 +2947,7 @@
             <w:pStyle w:val="Encabezado"/>
           </w:pPr>
           <w:r>
-            <w:t xml:space="preserve"> Versión: 1.0</w:t>
+            <w:t xml:space="preserve"> Versión: 1.1</w:t>
           </w:r>
         </w:p>
       </w:tc>
@@ -5992,7 +3239,7 @@
             <w:pStyle w:val="Encabezado"/>
           </w:pPr>
           <w:r>
-            <w:t xml:space="preserve"> Versión: 1.0</w:t>
+            <w:t xml:space="preserve"> Versión: 1.1</w:t>
           </w:r>
         </w:p>
       </w:tc>
@@ -8572,12 +5819,6 @@
   </w:num>
   <w:num w:numId="27">
     <w:abstractNumId w:val="22"/>
-  </w:num>
-  <w:num w:numId="28">
-    <w:abstractNumId w:val="22"/>
-    <w:lvlOverride w:ilvl="0">
-      <w:startOverride w:val="1"/>
-    </w:lvlOverride>
   </w:num>
 </w:numbering>
 </file>

</xml_diff>